<commit_message>
Polish PAP documents and production assets
</commit_message>
<xml_diff>
--- a/docs/PAP_ENTREGA/Manual_Tecnico_Greenerry_Srijan_Gautam.docx
+++ b/docs/PAP_ENTREGA/Manual_Tecnico_Greenerry_Srijan_Gautam.docx
@@ -14,6 +14,7 @@
       </w:tblGrid>
       <w:tr>
         <w:trPr>
+          <w:cantSplit/>
           <w:jc w:val="center"/>
         </w:trPr>
         <w:tc>
@@ -390,8 +391,9 @@
     <w:p>
       <w:pPr>
         <w:pStyle w:val="Heading1"/>
-      </w:pPr>
-      <w:bookmarkStart w:id="0" w:name="_Toc232585840"/>
+        <w:keepLines/>
+      </w:pPr>
+      <w:bookmarkStart w:id="0" w:name="_Toc232637503"/>
       <w:r>
         <w:rPr>
           <w:rFonts w:ascii="Arial" w:eastAsia="Arial" w:hAnsi="Arial" w:cs="Arial"/>
@@ -439,7 +441,7 @@
         </w:rPr>
         <w:fldChar w:fldCharType="separate"/>
       </w:r>
-      <w:hyperlink w:anchor="_Toc232585840" w:history="1">
+      <w:hyperlink w:anchor="_Toc232637503" w:history="1">
         <w:r>
           <w:rPr>
             <w:rStyle w:val="Hyperlink"/>
@@ -467,7 +469,7 @@
             <w:noProof/>
             <w:webHidden/>
           </w:rPr>
-          <w:instrText xml:space="preserve"> PAGEREF _Toc232585840 \h </w:instrText>
+          <w:instrText xml:space="preserve"> PAGEREF _Toc232637503 \h </w:instrText>
         </w:r>
         <w:r>
           <w:rPr>
@@ -514,7 +516,7 @@
           <w14:ligatures w14:val="standardContextual"/>
         </w:rPr>
       </w:pPr>
-      <w:hyperlink w:anchor="_Toc232585841" w:history="1">
+      <w:hyperlink w:anchor="_Toc232637504" w:history="1">
         <w:r>
           <w:rPr>
             <w:rStyle w:val="Hyperlink"/>
@@ -542,7 +544,7 @@
             <w:noProof/>
             <w:webHidden/>
           </w:rPr>
-          <w:instrText xml:space="preserve"> PAGEREF _Toc232585841 \h </w:instrText>
+          <w:instrText xml:space="preserve"> PAGEREF _Toc232637504 \h </w:instrText>
         </w:r>
         <w:r>
           <w:rPr>
@@ -589,7 +591,7 @@
           <w14:ligatures w14:val="standardContextual"/>
         </w:rPr>
       </w:pPr>
-      <w:hyperlink w:anchor="_Toc232585842" w:history="1">
+      <w:hyperlink w:anchor="_Toc232637505" w:history="1">
         <w:r>
           <w:rPr>
             <w:rStyle w:val="Hyperlink"/>
@@ -617,7 +619,7 @@
             <w:noProof/>
             <w:webHidden/>
           </w:rPr>
-          <w:instrText xml:space="preserve"> PAGEREF _Toc232585842 \h </w:instrText>
+          <w:instrText xml:space="preserve"> PAGEREF _Toc232637505 \h </w:instrText>
         </w:r>
         <w:r>
           <w:rPr>
@@ -664,7 +666,7 @@
           <w14:ligatures w14:val="standardContextual"/>
         </w:rPr>
       </w:pPr>
-      <w:hyperlink w:anchor="_Toc232585843" w:history="1">
+      <w:hyperlink w:anchor="_Toc232637506" w:history="1">
         <w:r>
           <w:rPr>
             <w:rStyle w:val="Hyperlink"/>
@@ -692,7 +694,7 @@
             <w:noProof/>
             <w:webHidden/>
           </w:rPr>
-          <w:instrText xml:space="preserve"> PAGEREF _Toc232585843 \h </w:instrText>
+          <w:instrText xml:space="preserve"> PAGEREF _Toc232637506 \h </w:instrText>
         </w:r>
         <w:r>
           <w:rPr>
@@ -739,7 +741,7 @@
           <w14:ligatures w14:val="standardContextual"/>
         </w:rPr>
       </w:pPr>
-      <w:hyperlink w:anchor="_Toc232585844" w:history="1">
+      <w:hyperlink w:anchor="_Toc232637507" w:history="1">
         <w:r>
           <w:rPr>
             <w:rStyle w:val="Hyperlink"/>
@@ -767,7 +769,7 @@
             <w:noProof/>
             <w:webHidden/>
           </w:rPr>
-          <w:instrText xml:space="preserve"> PAGEREF _Toc232585844 \h </w:instrText>
+          <w:instrText xml:space="preserve"> PAGEREF _Toc232637507 \h </w:instrText>
         </w:r>
         <w:r>
           <w:rPr>
@@ -814,7 +816,7 @@
           <w14:ligatures w14:val="standardContextual"/>
         </w:rPr>
       </w:pPr>
-      <w:hyperlink w:anchor="_Toc232585845" w:history="1">
+      <w:hyperlink w:anchor="_Toc232637508" w:history="1">
         <w:r>
           <w:rPr>
             <w:rStyle w:val="Hyperlink"/>
@@ -842,7 +844,7 @@
             <w:noProof/>
             <w:webHidden/>
           </w:rPr>
-          <w:instrText xml:space="preserve"> PAGEREF _Toc232585845 \h </w:instrText>
+          <w:instrText xml:space="preserve"> PAGEREF _Toc232637508 \h </w:instrText>
         </w:r>
         <w:r>
           <w:rPr>
@@ -889,7 +891,7 @@
           <w14:ligatures w14:val="standardContextual"/>
         </w:rPr>
       </w:pPr>
-      <w:hyperlink w:anchor="_Toc232585846" w:history="1">
+      <w:hyperlink w:anchor="_Toc232637509" w:history="1">
         <w:r>
           <w:rPr>
             <w:rStyle w:val="Hyperlink"/>
@@ -917,7 +919,7 @@
             <w:noProof/>
             <w:webHidden/>
           </w:rPr>
-          <w:instrText xml:space="preserve"> PAGEREF _Toc232585846 \h </w:instrText>
+          <w:instrText xml:space="preserve"> PAGEREF _Toc232637509 \h </w:instrText>
         </w:r>
         <w:r>
           <w:rPr>
@@ -964,7 +966,7 @@
           <w14:ligatures w14:val="standardContextual"/>
         </w:rPr>
       </w:pPr>
-      <w:hyperlink w:anchor="_Toc232585847" w:history="1">
+      <w:hyperlink w:anchor="_Toc232637510" w:history="1">
         <w:r>
           <w:rPr>
             <w:rStyle w:val="Hyperlink"/>
@@ -992,7 +994,7 @@
             <w:noProof/>
             <w:webHidden/>
           </w:rPr>
-          <w:instrText xml:space="preserve"> PAGEREF _Toc232585847 \h </w:instrText>
+          <w:instrText xml:space="preserve"> PAGEREF _Toc232637510 \h </w:instrText>
         </w:r>
         <w:r>
           <w:rPr>
@@ -1039,7 +1041,7 @@
           <w14:ligatures w14:val="standardContextual"/>
         </w:rPr>
       </w:pPr>
-      <w:hyperlink w:anchor="_Toc232585848" w:history="1">
+      <w:hyperlink w:anchor="_Toc232637511" w:history="1">
         <w:r>
           <w:rPr>
             <w:rStyle w:val="Hyperlink"/>
@@ -1067,7 +1069,7 @@
             <w:noProof/>
             <w:webHidden/>
           </w:rPr>
-          <w:instrText xml:space="preserve"> PAGEREF _Toc232585848 \h </w:instrText>
+          <w:instrText xml:space="preserve"> PAGEREF _Toc232637511 \h </w:instrText>
         </w:r>
         <w:r>
           <w:rPr>
@@ -1114,7 +1116,7 @@
           <w14:ligatures w14:val="standardContextual"/>
         </w:rPr>
       </w:pPr>
-      <w:hyperlink w:anchor="_Toc232585849" w:history="1">
+      <w:hyperlink w:anchor="_Toc232637512" w:history="1">
         <w:r>
           <w:rPr>
             <w:rStyle w:val="Hyperlink"/>
@@ -1142,7 +1144,7 @@
             <w:noProof/>
             <w:webHidden/>
           </w:rPr>
-          <w:instrText xml:space="preserve"> PAGEREF _Toc232585849 \h </w:instrText>
+          <w:instrText xml:space="preserve"> PAGEREF _Toc232637512 \h </w:instrText>
         </w:r>
         <w:r>
           <w:rPr>
@@ -1189,7 +1191,7 @@
           <w14:ligatures w14:val="standardContextual"/>
         </w:rPr>
       </w:pPr>
-      <w:hyperlink w:anchor="_Toc232585850" w:history="1">
+      <w:hyperlink w:anchor="_Toc232637513" w:history="1">
         <w:r>
           <w:rPr>
             <w:rStyle w:val="Hyperlink"/>
@@ -1217,7 +1219,7 @@
             <w:noProof/>
             <w:webHidden/>
           </w:rPr>
-          <w:instrText xml:space="preserve"> PAGEREF _Toc232585850 \h </w:instrText>
+          <w:instrText xml:space="preserve"> PAGEREF _Toc232637513 \h </w:instrText>
         </w:r>
         <w:r>
           <w:rPr>
@@ -1264,7 +1266,7 @@
           <w14:ligatures w14:val="standardContextual"/>
         </w:rPr>
       </w:pPr>
-      <w:hyperlink w:anchor="_Toc232585851" w:history="1">
+      <w:hyperlink w:anchor="_Toc232637514" w:history="1">
         <w:r>
           <w:rPr>
             <w:rStyle w:val="Hyperlink"/>
@@ -1292,7 +1294,7 @@
             <w:noProof/>
             <w:webHidden/>
           </w:rPr>
-          <w:instrText xml:space="preserve"> PAGEREF _Toc232585851 \h </w:instrText>
+          <w:instrText xml:space="preserve"> PAGEREF _Toc232637514 \h </w:instrText>
         </w:r>
         <w:r>
           <w:rPr>
@@ -1339,7 +1341,7 @@
           <w14:ligatures w14:val="standardContextual"/>
         </w:rPr>
       </w:pPr>
-      <w:hyperlink w:anchor="_Toc232585852" w:history="1">
+      <w:hyperlink w:anchor="_Toc232637515" w:history="1">
         <w:r>
           <w:rPr>
             <w:rStyle w:val="Hyperlink"/>
@@ -1367,7 +1369,7 @@
             <w:noProof/>
             <w:webHidden/>
           </w:rPr>
-          <w:instrText xml:space="preserve"> PAGEREF _Toc232585852 \h </w:instrText>
+          <w:instrText xml:space="preserve"> PAGEREF _Toc232637515 \h </w:instrText>
         </w:r>
         <w:r>
           <w:rPr>
@@ -1414,7 +1416,7 @@
           <w14:ligatures w14:val="standardContextual"/>
         </w:rPr>
       </w:pPr>
-      <w:hyperlink w:anchor="_Toc232585853" w:history="1">
+      <w:hyperlink w:anchor="_Toc232637516" w:history="1">
         <w:r>
           <w:rPr>
             <w:rStyle w:val="Hyperlink"/>
@@ -1442,7 +1444,7 @@
             <w:noProof/>
             <w:webHidden/>
           </w:rPr>
-          <w:instrText xml:space="preserve"> PAGEREF _Toc232585853 \h </w:instrText>
+          <w:instrText xml:space="preserve"> PAGEREF _Toc232637516 \h </w:instrText>
         </w:r>
         <w:r>
           <w:rPr>
@@ -1489,7 +1491,7 @@
           <w14:ligatures w14:val="standardContextual"/>
         </w:rPr>
       </w:pPr>
-      <w:hyperlink w:anchor="_Toc232585854" w:history="1">
+      <w:hyperlink w:anchor="_Toc232637517" w:history="1">
         <w:r>
           <w:rPr>
             <w:rStyle w:val="Hyperlink"/>
@@ -1516,7 +1518,7 @@
             <w:noProof/>
             <w:webHidden/>
           </w:rPr>
-          <w:instrText xml:space="preserve"> PAGEREF _Toc232585854 \h </w:instrText>
+          <w:instrText xml:space="preserve"> PAGEREF _Toc232637517 \h </w:instrText>
         </w:r>
         <w:r>
           <w:rPr>
@@ -1563,9 +1565,10 @@
     <w:p>
       <w:pPr>
         <w:pStyle w:val="Heading1"/>
+        <w:keepLines/>
         <w:pageBreakBefore/>
       </w:pPr>
-      <w:bookmarkStart w:id="1" w:name="_Toc232585841"/>
+      <w:bookmarkStart w:id="1" w:name="_Toc232637504"/>
       <w:r>
         <w:rPr>
           <w:rFonts w:ascii="Arial" w:eastAsia="Arial" w:hAnsi="Arial" w:cs="Arial"/>
@@ -1621,8 +1624,9 @@
     <w:p>
       <w:pPr>
         <w:pStyle w:val="Heading1"/>
-      </w:pPr>
-      <w:bookmarkStart w:id="2" w:name="_Toc232585842"/>
+        <w:keepLines/>
+      </w:pPr>
+      <w:bookmarkStart w:id="2" w:name="_Toc232637505"/>
       <w:r>
         <w:rPr>
           <w:rFonts w:ascii="Arial" w:eastAsia="Arial" w:hAnsi="Arial" w:cs="Arial"/>
@@ -2047,8 +2051,9 @@
     <w:p>
       <w:pPr>
         <w:pStyle w:val="Heading1"/>
-      </w:pPr>
-      <w:bookmarkStart w:id="3" w:name="_Toc232585843"/>
+        <w:keepLines/>
+      </w:pPr>
+      <w:bookmarkStart w:id="3" w:name="_Toc232637506"/>
       <w:r>
         <w:rPr>
           <w:rFonts w:ascii="Arial" w:eastAsia="Arial" w:hAnsi="Arial" w:cs="Arial"/>
@@ -2642,8 +2647,9 @@
     <w:p>
       <w:pPr>
         <w:pStyle w:val="Heading1"/>
-      </w:pPr>
-      <w:bookmarkStart w:id="4" w:name="_Toc232585844"/>
+        <w:keepLines/>
+      </w:pPr>
+      <w:bookmarkStart w:id="4" w:name="_Toc232637507"/>
       <w:r>
         <w:rPr>
           <w:rFonts w:ascii="Arial" w:eastAsia="Arial" w:hAnsi="Arial" w:cs="Arial"/>
@@ -2656,7 +2662,7 @@
     <w:p>
       <w:pPr>
         <w:ind w:firstLine="709"/>
-        <w:jc w:val="both"/>
+        <w:jc w:val="left"/>
       </w:pPr>
       <w:r>
         <w:t>Fluxo recomendado de instalação: iniciar Apache e MySQL no XAMPP, importar a base greenerry no phpMyAdmin, confirmar includes/config.php, abrir a homepage local, testar login de utilizador/artista e, por fim, abrir o URL reservado da administração.</w:t>
@@ -2666,7 +2672,7 @@
       <w:pPr>
         <w:pStyle w:val="ListBullet"/>
         <w:ind w:left="425" w:firstLine="709"/>
-        <w:jc w:val="both"/>
+        <w:jc w:val="left"/>
       </w:pPr>
       <w:r>
         <w:rPr>
@@ -2679,7 +2685,7 @@
       <w:pPr>
         <w:pStyle w:val="ListBullet"/>
         <w:ind w:left="425" w:firstLine="709"/>
-        <w:jc w:val="both"/>
+        <w:jc w:val="left"/>
       </w:pPr>
       <w:r>
         <w:rPr>
@@ -2692,7 +2698,7 @@
       <w:pPr>
         <w:pStyle w:val="ListBullet"/>
         <w:ind w:left="425" w:firstLine="709"/>
-        <w:jc w:val="both"/>
+        <w:jc w:val="left"/>
       </w:pPr>
       <w:r>
         <w:rPr>
@@ -2705,7 +2711,7 @@
       <w:pPr>
         <w:pStyle w:val="ListBullet"/>
         <w:ind w:left="425" w:firstLine="709"/>
-        <w:jc w:val="both"/>
+        <w:jc w:val="left"/>
       </w:pPr>
       <w:r>
         <w:rPr>
@@ -2718,7 +2724,7 @@
       <w:pPr>
         <w:pStyle w:val="ListBullet"/>
         <w:ind w:left="425" w:firstLine="709"/>
-        <w:jc w:val="both"/>
+        <w:jc w:val="left"/>
       </w:pPr>
       <w:r>
         <w:rPr>
@@ -2731,7 +2737,7 @@
       <w:pPr>
         <w:pStyle w:val="ListBullet"/>
         <w:ind w:left="425" w:firstLine="709"/>
-        <w:jc w:val="both"/>
+        <w:jc w:val="left"/>
       </w:pPr>
       <w:r>
         <w:rPr>
@@ -2744,7 +2750,7 @@
       <w:pPr>
         <w:pStyle w:val="ListBullet"/>
         <w:ind w:left="425" w:firstLine="709"/>
-        <w:jc w:val="both"/>
+        <w:jc w:val="left"/>
       </w:pPr>
       <w:r>
         <w:rPr>
@@ -2757,7 +2763,7 @@
       <w:pPr>
         <w:pStyle w:val="ListBullet"/>
         <w:ind w:left="425" w:firstLine="709"/>
-        <w:jc w:val="both"/>
+        <w:jc w:val="left"/>
       </w:pPr>
       <w:r>
         <w:rPr>
@@ -2770,7 +2776,7 @@
       <w:pPr>
         <w:pStyle w:val="ListBullet"/>
         <w:ind w:left="425" w:firstLine="709"/>
-        <w:jc w:val="both"/>
+        <w:jc w:val="left"/>
       </w:pPr>
       <w:r>
         <w:rPr>
@@ -2782,8 +2788,9 @@
     <w:p>
       <w:pPr>
         <w:pStyle w:val="Heading1"/>
-      </w:pPr>
-      <w:bookmarkStart w:id="5" w:name="_Toc232585845"/>
+        <w:keepLines/>
+      </w:pPr>
+      <w:bookmarkStart w:id="5" w:name="_Toc232637508"/>
       <w:r>
         <w:rPr>
           <w:rFonts w:ascii="Arial" w:eastAsia="Arial" w:hAnsi="Arial" w:cs="Arial"/>
@@ -3225,8 +3232,9 @@
     <w:p>
       <w:pPr>
         <w:pStyle w:val="Heading1"/>
-      </w:pPr>
-      <w:bookmarkStart w:id="6" w:name="_Toc232585846"/>
+        <w:keepLines/>
+      </w:pPr>
+      <w:bookmarkStart w:id="6" w:name="_Toc232637509"/>
       <w:r>
         <w:rPr>
           <w:rFonts w:ascii="Arial" w:eastAsia="Arial" w:hAnsi="Arial" w:cs="Arial"/>
@@ -3495,8 +3503,9 @@
     <w:p>
       <w:pPr>
         <w:pStyle w:val="Heading1"/>
-      </w:pPr>
-      <w:bookmarkStart w:id="7" w:name="_Toc232585847"/>
+        <w:keepLines/>
+      </w:pPr>
+      <w:bookmarkStart w:id="7" w:name="_Toc232637510"/>
       <w:r>
         <w:rPr>
           <w:rFonts w:ascii="Arial" w:eastAsia="Arial" w:hAnsi="Arial" w:cs="Arial"/>
@@ -3509,7 +3518,7 @@
     <w:p>
       <w:pPr>
         <w:ind w:firstLine="709"/>
-        <w:jc w:val="both"/>
+        <w:jc w:val="left"/>
       </w:pPr>
       <w:r>
         <w:t>A administração não é acedida pelo formulário público de utilizador/artista. Para testar a área administrativa deve ser usado o URL reservado http://localhost/dashboard/greenerry/admin/login.php. A conta greenerry333@gmail.com representa a super administração para a demonstração; outras contas admin ficam registadas na tabela admin e dependem de permissões ativas.</w:t>
@@ -3791,8 +3800,9 @@
     <w:p>
       <w:pPr>
         <w:pStyle w:val="Heading1"/>
-      </w:pPr>
-      <w:bookmarkStart w:id="8" w:name="_Toc232585848"/>
+        <w:keepLines/>
+      </w:pPr>
+      <w:bookmarkStart w:id="8" w:name="_Toc232637511"/>
       <w:r>
         <w:rPr>
           <w:rFonts w:ascii="Arial" w:eastAsia="Arial" w:hAnsi="Arial" w:cs="Arial"/>
@@ -3806,7 +3816,7 @@
       <w:pPr>
         <w:pStyle w:val="ListBullet"/>
         <w:ind w:left="425" w:firstLine="709"/>
-        <w:jc w:val="both"/>
+        <w:jc w:val="left"/>
       </w:pPr>
       <w:r>
         <w:rPr>
@@ -3819,7 +3829,7 @@
       <w:pPr>
         <w:pStyle w:val="ListBullet"/>
         <w:ind w:left="425" w:firstLine="709"/>
-        <w:jc w:val="both"/>
+        <w:jc w:val="left"/>
       </w:pPr>
       <w:r>
         <w:rPr>
@@ -3832,7 +3842,7 @@
       <w:pPr>
         <w:pStyle w:val="ListBullet"/>
         <w:ind w:left="425" w:firstLine="709"/>
-        <w:jc w:val="both"/>
+        <w:jc w:val="left"/>
       </w:pPr>
       <w:r>
         <w:rPr>
@@ -3845,7 +3855,7 @@
       <w:pPr>
         <w:pStyle w:val="ListBullet"/>
         <w:ind w:left="425" w:firstLine="709"/>
-        <w:jc w:val="both"/>
+        <w:jc w:val="left"/>
       </w:pPr>
       <w:r>
         <w:rPr>
@@ -3858,7 +3868,7 @@
       <w:pPr>
         <w:pStyle w:val="ListBullet"/>
         <w:ind w:left="425" w:firstLine="709"/>
-        <w:jc w:val="both"/>
+        <w:jc w:val="left"/>
       </w:pPr>
       <w:r>
         <w:rPr>
@@ -3871,7 +3881,7 @@
       <w:pPr>
         <w:pStyle w:val="ListBullet"/>
         <w:ind w:left="425" w:firstLine="709"/>
-        <w:jc w:val="both"/>
+        <w:jc w:val="left"/>
       </w:pPr>
       <w:r>
         <w:rPr>
@@ -3884,7 +3894,7 @@
       <w:pPr>
         <w:pStyle w:val="ListBullet"/>
         <w:ind w:left="425" w:firstLine="709"/>
-        <w:jc w:val="both"/>
+        <w:jc w:val="left"/>
       </w:pPr>
       <w:r>
         <w:rPr>
@@ -3897,7 +3907,7 @@
       <w:pPr>
         <w:pStyle w:val="ListBullet"/>
         <w:ind w:left="425" w:firstLine="709"/>
-        <w:jc w:val="both"/>
+        <w:jc w:val="left"/>
       </w:pPr>
       <w:r>
         <w:rPr>
@@ -3910,7 +3920,7 @@
       <w:pPr>
         <w:pStyle w:val="ListBullet"/>
         <w:ind w:left="425" w:firstLine="709"/>
-        <w:jc w:val="both"/>
+        <w:jc w:val="left"/>
       </w:pPr>
       <w:r>
         <w:rPr>
@@ -3923,7 +3933,7 @@
       <w:pPr>
         <w:pStyle w:val="ListBullet"/>
         <w:ind w:left="425" w:firstLine="709"/>
-        <w:jc w:val="both"/>
+        <w:jc w:val="left"/>
       </w:pPr>
       <w:r>
         <w:rPr>
@@ -3936,7 +3946,7 @@
       <w:pPr>
         <w:pStyle w:val="ListBullet"/>
         <w:ind w:left="425" w:firstLine="709"/>
-        <w:jc w:val="both"/>
+        <w:jc w:val="left"/>
       </w:pPr>
       <w:r>
         <w:rPr>
@@ -3949,7 +3959,7 @@
       <w:pPr>
         <w:pStyle w:val="ListBullet"/>
         <w:ind w:left="425" w:firstLine="709"/>
-        <w:jc w:val="both"/>
+        <w:jc w:val="left"/>
       </w:pPr>
       <w:r>
         <w:rPr>
@@ -3961,8 +3971,9 @@
     <w:p>
       <w:pPr>
         <w:pStyle w:val="Heading1"/>
-      </w:pPr>
-      <w:bookmarkStart w:id="9" w:name="_Toc232585849"/>
+        <w:keepLines/>
+      </w:pPr>
+      <w:bookmarkStart w:id="9" w:name="_Toc232637512"/>
       <w:r>
         <w:rPr>
           <w:rFonts w:ascii="Arial" w:eastAsia="Arial" w:hAnsi="Arial" w:cs="Arial"/>
@@ -4287,8 +4298,9 @@
     <w:p>
       <w:pPr>
         <w:pStyle w:val="Heading1"/>
-      </w:pPr>
-      <w:bookmarkStart w:id="10" w:name="_Toc232585850"/>
+        <w:keepLines/>
+      </w:pPr>
+      <w:bookmarkStart w:id="10" w:name="_Toc232637513"/>
       <w:r>
         <w:rPr>
           <w:rFonts w:ascii="Arial" w:eastAsia="Arial" w:hAnsi="Arial" w:cs="Arial"/>
@@ -4770,8 +4782,9 @@
     <w:p>
       <w:pPr>
         <w:pStyle w:val="Heading1"/>
-      </w:pPr>
-      <w:bookmarkStart w:id="11" w:name="_Toc232585851"/>
+        <w:keepLines/>
+      </w:pPr>
+      <w:bookmarkStart w:id="11" w:name="_Toc232637514"/>
       <w:r>
         <w:rPr>
           <w:rFonts w:ascii="Arial" w:eastAsia="Arial" w:hAnsi="Arial" w:cs="Arial"/>
@@ -5193,8 +5206,9 @@
     <w:p>
       <w:pPr>
         <w:pStyle w:val="Heading1"/>
-      </w:pPr>
-      <w:bookmarkStart w:id="12" w:name="_Toc232585852"/>
+        <w:keepLines/>
+      </w:pPr>
+      <w:bookmarkStart w:id="12" w:name="_Toc232637515"/>
       <w:r>
         <w:rPr>
           <w:rFonts w:ascii="Arial" w:eastAsia="Arial" w:hAnsi="Arial" w:cs="Arial"/>
@@ -5677,8 +5691,9 @@
     <w:p>
       <w:pPr>
         <w:pStyle w:val="Heading1"/>
-      </w:pPr>
-      <w:bookmarkStart w:id="13" w:name="_Toc232585853"/>
+        <w:keepLines/>
+      </w:pPr>
+      <w:bookmarkStart w:id="13" w:name="_Toc232637516"/>
       <w:r>
         <w:rPr>
           <w:rFonts w:ascii="Arial" w:eastAsia="Arial" w:hAnsi="Arial" w:cs="Arial"/>
@@ -5754,7 +5769,7 @@
         <w:keepLines/>
         <w:spacing w:before="20" w:line="259" w:lineRule="auto"/>
         <w:ind w:firstLine="0"/>
-        <w:jc w:val="center"/>
+        <w:jc w:val="both"/>
       </w:pPr>
       <w:r>
         <w:rPr>
@@ -5820,7 +5835,7 @@
         <w:keepLines/>
         <w:spacing w:before="20" w:line="259" w:lineRule="auto"/>
         <w:ind w:firstLine="0"/>
-        <w:jc w:val="center"/>
+        <w:jc w:val="both"/>
       </w:pPr>
       <w:r>
         <w:rPr>
@@ -5885,7 +5900,7 @@
         <w:keepLines/>
         <w:spacing w:before="20" w:line="259" w:lineRule="auto"/>
         <w:ind w:firstLine="0"/>
-        <w:jc w:val="center"/>
+        <w:jc w:val="both"/>
       </w:pPr>
       <w:r>
         <w:rPr>
@@ -5950,7 +5965,7 @@
         <w:keepLines/>
         <w:spacing w:before="20" w:line="259" w:lineRule="auto"/>
         <w:ind w:firstLine="0"/>
-        <w:jc w:val="center"/>
+        <w:jc w:val="both"/>
       </w:pPr>
       <w:r>
         <w:rPr>
@@ -5964,8 +5979,9 @@
     <w:p>
       <w:pPr>
         <w:pStyle w:val="Heading2"/>
-      </w:pPr>
-      <w:bookmarkStart w:id="14" w:name="_Toc232585854"/>
+        <w:keepLines/>
+      </w:pPr>
+      <w:bookmarkStart w:id="14" w:name="_Toc232637517"/>
       <w:r>
         <w:rPr>
           <w:rFonts w:ascii="Arial" w:eastAsia="Arial" w:hAnsi="Arial"/>
@@ -6037,7 +6053,7 @@
         <w:keepLines/>
         <w:spacing w:before="20"/>
         <w:ind w:firstLine="0"/>
-        <w:jc w:val="center"/>
+        <w:jc w:val="both"/>
       </w:pPr>
       <w:r>
         <w:rPr>
@@ -6100,7 +6116,7 @@
         <w:keepLines/>
         <w:spacing w:before="20"/>
         <w:ind w:firstLine="0"/>
-        <w:jc w:val="center"/>
+        <w:jc w:val="both"/>
       </w:pPr>
       <w:r>
         <w:rPr>
@@ -6163,7 +6179,7 @@
         <w:keepLines/>
         <w:spacing w:before="20"/>
         <w:ind w:firstLine="0"/>
-        <w:jc w:val="center"/>
+        <w:jc w:val="both"/>
       </w:pPr>
       <w:r>
         <w:rPr>
@@ -6227,7 +6243,7 @@
         <w:keepLines/>
         <w:spacing w:before="20"/>
         <w:ind w:firstLine="0"/>
-        <w:jc w:val="center"/>
+        <w:jc w:val="both"/>
       </w:pPr>
       <w:r>
         <w:rPr>
@@ -6290,7 +6306,7 @@
         <w:keepLines/>
         <w:spacing w:before="20"/>
         <w:ind w:firstLine="0"/>
-        <w:jc w:val="center"/>
+        <w:jc w:val="both"/>
       </w:pPr>
       <w:r>
         <w:rPr>
@@ -6353,7 +6369,7 @@
         <w:keepLines/>
         <w:spacing w:before="20"/>
         <w:ind w:firstLine="0"/>
-        <w:jc w:val="center"/>
+        <w:jc w:val="both"/>
       </w:pPr>
       <w:r>
         <w:rPr>
@@ -6417,7 +6433,7 @@
         <w:keepLines/>
         <w:spacing w:before="20"/>
         <w:ind w:firstLine="0"/>
-        <w:jc w:val="center"/>
+        <w:jc w:val="both"/>
       </w:pPr>
       <w:r>
         <w:rPr>
@@ -6480,7 +6496,7 @@
         <w:keepLines/>
         <w:spacing w:before="20"/>
         <w:ind w:firstLine="0"/>
-        <w:jc w:val="center"/>
+        <w:jc w:val="both"/>
       </w:pPr>
       <w:r>
         <w:rPr>
@@ -6543,7 +6559,7 @@
         <w:keepLines/>
         <w:spacing w:before="20"/>
         <w:ind w:firstLine="0"/>
-        <w:jc w:val="center"/>
+        <w:jc w:val="both"/>
       </w:pPr>
       <w:r>
         <w:rPr>

</xml_diff>

<commit_message>
Finalize PAP website and print documents
</commit_message>
<xml_diff>
--- a/docs/PAP_ENTREGA/Manual_Tecnico_Greenerry_Srijan_Gautam.docx
+++ b/docs/PAP_ENTREGA/Manual_Tecnico_Greenerry_Srijan_Gautam.docx
@@ -164,12 +164,27 @@
       <w:pPr>
         <w:ind w:firstLine="709"/>
         <w:jc w:val="both"/>
+        <w:rPr>
+          <w:lang w:eastAsia="pt-PT" w:bidi="pt-PT"/>
+        </w:rPr>
       </w:pPr>
       <w:r>
         <w:rPr>
           <w:lang w:eastAsia="pt-PT" w:bidi="pt-PT"/>
         </w:rPr>
-        <w:t>Curso Profissional de Técnico de Gestão e Programação de Sistemas Informáticos</w:t>
+        <w:t>Curso Profissional de Técnico de Gestão e Programação de Sistemas</w:t>
+      </w:r>
+    </w:p>
+    <w:p>
+      <w:pPr>
+        <w:ind w:firstLine="709"/>
+        <w:jc w:val="both"/>
+      </w:pPr>
+      <w:r>
+        <w:rPr>
+          <w:lang w:eastAsia="pt-PT" w:bidi="pt-PT"/>
+        </w:rPr>
+        <w:t>Informáticos</w:t>
       </w:r>
     </w:p>
     <w:p>
@@ -1588,7 +1603,21 @@
         <w:rPr>
           <w:lang w:eastAsia="pt-PT" w:bidi="pt-PT"/>
         </w:rPr>
-        <w:t>Este manual técnico explica como instalar, configurar, executar e validar a plataforma Greenerry em ambiente local. O documento foi preparado para apoiar a avaliação da Prova de Aptidão Profissional e para permitir que o projeto seja reproduzido numa máquina com XAMPP.</w:t>
+        <w:t xml:space="preserve">Este manual técnico explica como instalar, configurar, executar e validar a plataforma </w:t>
+      </w:r>
+      <w:proofErr w:type="spellStart"/>
+      <w:r>
+        <w:rPr>
+          <w:lang w:eastAsia="pt-PT" w:bidi="pt-PT"/>
+        </w:rPr>
+        <w:t>Greenerry</w:t>
+      </w:r>
+      <w:proofErr w:type="spellEnd"/>
+      <w:r>
+        <w:rPr>
+          <w:lang w:eastAsia="pt-PT" w:bidi="pt-PT"/>
+        </w:rPr>
+        <w:t xml:space="preserve"> em ambiente local. O documento foi preparado para apoiar a avaliação da Prova de Aptidão Profissional e para permitir que o projeto seja reproduzido numa máquina com XAMPP.</w:t>
       </w:r>
     </w:p>
     <w:p>
@@ -1762,7 +1791,23 @@
                 <w:sz w:val="18"/>
                 <w:lang w:eastAsia="pt-PT" w:bidi="pt-PT"/>
               </w:rPr>
-              <w:t>Windows, com permissões para executar XAMPP e aceder à pasta htdocs.</w:t>
+              <w:t xml:space="preserve">Windows, com permissões para executar XAMPP e aceder à pasta </w:t>
+            </w:r>
+            <w:proofErr w:type="spellStart"/>
+            <w:r>
+              <w:rPr>
+                <w:sz w:val="18"/>
+                <w:lang w:eastAsia="pt-PT" w:bidi="pt-PT"/>
+              </w:rPr>
+              <w:t>htdocs</w:t>
+            </w:r>
+            <w:proofErr w:type="spellEnd"/>
+            <w:r>
+              <w:rPr>
+                <w:sz w:val="18"/>
+                <w:lang w:eastAsia="pt-PT" w:bidi="pt-PT"/>
+              </w:rPr>
+              <w:t>.</w:t>
             </w:r>
           </w:p>
         </w:tc>
@@ -1818,7 +1863,39 @@
                 <w:sz w:val="18"/>
                 <w:lang w:eastAsia="pt-PT" w:bidi="pt-PT"/>
               </w:rPr>
-              <w:t>XAMPP com Apache e MySQL/MariaDB ativos.</w:t>
+              <w:t xml:space="preserve">XAMPP com Apache e </w:t>
+            </w:r>
+            <w:proofErr w:type="spellStart"/>
+            <w:r>
+              <w:rPr>
+                <w:sz w:val="18"/>
+                <w:lang w:eastAsia="pt-PT" w:bidi="pt-PT"/>
+              </w:rPr>
+              <w:t>MySQL</w:t>
+            </w:r>
+            <w:proofErr w:type="spellEnd"/>
+            <w:r>
+              <w:rPr>
+                <w:sz w:val="18"/>
+                <w:lang w:eastAsia="pt-PT" w:bidi="pt-PT"/>
+              </w:rPr>
+              <w:t>/</w:t>
+            </w:r>
+            <w:proofErr w:type="spellStart"/>
+            <w:r>
+              <w:rPr>
+                <w:sz w:val="18"/>
+                <w:lang w:eastAsia="pt-PT" w:bidi="pt-PT"/>
+              </w:rPr>
+              <w:t>MariaDB</w:t>
+            </w:r>
+            <w:proofErr w:type="spellEnd"/>
+            <w:r>
+              <w:rPr>
+                <w:sz w:val="18"/>
+                <w:lang w:eastAsia="pt-PT" w:bidi="pt-PT"/>
+              </w:rPr>
+              <w:t xml:space="preserve"> ativos.</w:t>
             </w:r>
           </w:p>
         </w:tc>
@@ -1925,12 +2002,53 @@
               <w:spacing w:after="20" w:line="276" w:lineRule="auto"/>
               <w:ind w:firstLine="0"/>
             </w:pPr>
+            <w:proofErr w:type="spellStart"/>
             <w:r>
               <w:rPr>
                 <w:sz w:val="18"/>
                 <w:lang w:eastAsia="pt-PT" w:bidi="pt-PT"/>
               </w:rPr>
-              <w:t>MySQL/MariaDB, base chamada greenerry.</w:t>
+              <w:t>MySQL</w:t>
+            </w:r>
+            <w:proofErr w:type="spellEnd"/>
+            <w:r>
+              <w:rPr>
+                <w:sz w:val="18"/>
+                <w:lang w:eastAsia="pt-PT" w:bidi="pt-PT"/>
+              </w:rPr>
+              <w:t>/</w:t>
+            </w:r>
+            <w:proofErr w:type="spellStart"/>
+            <w:r>
+              <w:rPr>
+                <w:sz w:val="18"/>
+                <w:lang w:eastAsia="pt-PT" w:bidi="pt-PT"/>
+              </w:rPr>
+              <w:t>MariaDB</w:t>
+            </w:r>
+            <w:proofErr w:type="spellEnd"/>
+            <w:r>
+              <w:rPr>
+                <w:sz w:val="18"/>
+                <w:lang w:eastAsia="pt-PT" w:bidi="pt-PT"/>
+              </w:rPr>
+              <w:t xml:space="preserve">, base chamada </w:t>
+            </w:r>
+            <w:proofErr w:type="spellStart"/>
+            <w:r>
+              <w:rPr>
+                <w:sz w:val="18"/>
+                <w:lang w:eastAsia="pt-PT" w:bidi="pt-PT"/>
+              </w:rPr>
+              <w:t>greenerry</w:t>
+            </w:r>
+            <w:proofErr w:type="spellEnd"/>
+            <w:r>
+              <w:rPr>
+                <w:sz w:val="18"/>
+                <w:lang w:eastAsia="pt-PT" w:bidi="pt-PT"/>
+              </w:rPr>
+              <w:t>.</w:t>
             </w:r>
           </w:p>
         </w:tc>
@@ -1956,6 +2074,7 @@
               <w:spacing w:after="20" w:line="276" w:lineRule="auto"/>
               <w:ind w:firstLine="0"/>
             </w:pPr>
+            <w:proofErr w:type="spellStart"/>
             <w:r>
               <w:rPr>
                 <w:sz w:val="18"/>
@@ -1963,6 +2082,7 @@
               </w:rPr>
               <w:t>Composer</w:t>
             </w:r>
+            <w:proofErr w:type="spellEnd"/>
           </w:p>
         </w:tc>
         <w:tc>
@@ -1986,7 +2106,23 @@
                 <w:sz w:val="18"/>
                 <w:lang w:eastAsia="pt-PT" w:bidi="pt-PT"/>
               </w:rPr>
-              <w:t>Necessário se a pasta vendor não estiver incluída.</w:t>
+              <w:t xml:space="preserve">Necessário se a pasta </w:t>
+            </w:r>
+            <w:proofErr w:type="spellStart"/>
+            <w:r>
+              <w:rPr>
+                <w:sz w:val="18"/>
+                <w:lang w:eastAsia="pt-PT" w:bidi="pt-PT"/>
+              </w:rPr>
+              <w:t>vendor</w:t>
+            </w:r>
+            <w:proofErr w:type="spellEnd"/>
+            <w:r>
+              <w:rPr>
+                <w:sz w:val="18"/>
+                <w:lang w:eastAsia="pt-PT" w:bidi="pt-PT"/>
+              </w:rPr>
+              <w:t xml:space="preserve"> não estiver incluída.</w:t>
             </w:r>
           </w:p>
         </w:tc>
@@ -2042,7 +2178,23 @@
                 <w:sz w:val="18"/>
                 <w:lang w:eastAsia="pt-PT" w:bidi="pt-PT"/>
               </w:rPr>
-              <w:t>Chrome, Edge, Firefox ou outro navegador moderno.</w:t>
+              <w:t xml:space="preserve">Chrome, </w:t>
+            </w:r>
+            <w:proofErr w:type="spellStart"/>
+            <w:r>
+              <w:rPr>
+                <w:sz w:val="18"/>
+                <w:lang w:eastAsia="pt-PT" w:bidi="pt-PT"/>
+              </w:rPr>
+              <w:t>Edge</w:t>
+            </w:r>
+            <w:proofErr w:type="spellEnd"/>
+            <w:r>
+              <w:rPr>
+                <w:sz w:val="18"/>
+                <w:lang w:eastAsia="pt-PT" w:bidi="pt-PT"/>
+              </w:rPr>
+              <w:t>, Firefox ou outro navegador moderno.</w:t>
             </w:r>
           </w:p>
         </w:tc>
@@ -2159,12 +2311,21 @@
               <w:spacing w:after="20" w:line="276" w:lineRule="auto"/>
               <w:ind w:firstLine="0"/>
             </w:pPr>
+            <w:proofErr w:type="spellStart"/>
             <w:r>
               <w:rPr>
                 <w:sz w:val="18"/>
                 <w:lang w:eastAsia="pt-PT" w:bidi="pt-PT"/>
               </w:rPr>
-              <w:t>admin/</w:t>
+              <w:t>admin</w:t>
+            </w:r>
+            <w:proofErr w:type="spellEnd"/>
+            <w:r>
+              <w:rPr>
+                <w:sz w:val="18"/>
+                <w:lang w:eastAsia="pt-PT" w:bidi="pt-PT"/>
+              </w:rPr>
+              <w:t>/</w:t>
             </w:r>
           </w:p>
         </w:tc>
@@ -2189,7 +2350,23 @@
                 <w:sz w:val="18"/>
                 <w:lang w:eastAsia="pt-PT" w:bidi="pt-PT"/>
               </w:rPr>
-              <w:t>Painel administrativo: dashboard, produtos, categorias, géneros, lançamentos, encomendas, utilizadores, mensagens, relatórios, manutenção, administradores e definições.</w:t>
+              <w:t xml:space="preserve">Painel administrativo: </w:t>
+            </w:r>
+            <w:proofErr w:type="spellStart"/>
+            <w:r>
+              <w:rPr>
+                <w:sz w:val="18"/>
+                <w:lang w:eastAsia="pt-PT" w:bidi="pt-PT"/>
+              </w:rPr>
+              <w:t>dashboard</w:t>
+            </w:r>
+            <w:proofErr w:type="spellEnd"/>
+            <w:r>
+              <w:rPr>
+                <w:sz w:val="18"/>
+                <w:lang w:eastAsia="pt-PT" w:bidi="pt-PT"/>
+              </w:rPr>
+              <w:t>, produtos, categorias, géneros, lançamentos, encomendas, utilizadores, mensagens, relatórios, manutenção, administradores e definições.</w:t>
             </w:r>
           </w:p>
         </w:tc>
@@ -2215,12 +2392,21 @@
               <w:spacing w:after="20" w:line="276" w:lineRule="auto"/>
               <w:ind w:firstLine="0"/>
             </w:pPr>
+            <w:proofErr w:type="spellStart"/>
             <w:r>
               <w:rPr>
                 <w:sz w:val="18"/>
                 <w:lang w:eastAsia="pt-PT" w:bidi="pt-PT"/>
               </w:rPr>
-              <w:t>api/</w:t>
+              <w:t>api</w:t>
+            </w:r>
+            <w:proofErr w:type="spellEnd"/>
+            <w:r>
+              <w:rPr>
+                <w:sz w:val="18"/>
+                <w:lang w:eastAsia="pt-PT" w:bidi="pt-PT"/>
+              </w:rPr>
+              <w:t>/</w:t>
             </w:r>
           </w:p>
         </w:tc>
@@ -2240,12 +2426,21 @@
               <w:spacing w:after="20" w:line="276" w:lineRule="auto"/>
               <w:ind w:firstLine="0"/>
             </w:pPr>
+            <w:proofErr w:type="spellStart"/>
             <w:r>
               <w:rPr>
                 <w:sz w:val="18"/>
                 <w:lang w:eastAsia="pt-PT" w:bidi="pt-PT"/>
               </w:rPr>
-              <w:t>Endpoints usados por ações assíncronas da interface.</w:t>
+              <w:t>Endpoints</w:t>
+            </w:r>
+            <w:proofErr w:type="spellEnd"/>
+            <w:r>
+              <w:rPr>
+                <w:sz w:val="18"/>
+                <w:lang w:eastAsia="pt-PT" w:bidi="pt-PT"/>
+              </w:rPr>
+              <w:t xml:space="preserve"> usados por ações assíncronas da interface.</w:t>
             </w:r>
           </w:p>
         </w:tc>
@@ -2271,12 +2466,21 @@
               <w:spacing w:after="20" w:line="276" w:lineRule="auto"/>
               <w:ind w:firstLine="0"/>
             </w:pPr>
+            <w:proofErr w:type="spellStart"/>
             <w:r>
               <w:rPr>
                 <w:sz w:val="18"/>
                 <w:lang w:eastAsia="pt-PT" w:bidi="pt-PT"/>
               </w:rPr>
-              <w:t>assets/</w:t>
+              <w:t>assets</w:t>
+            </w:r>
+            <w:proofErr w:type="spellEnd"/>
+            <w:r>
+              <w:rPr>
+                <w:sz w:val="18"/>
+                <w:lang w:eastAsia="pt-PT" w:bidi="pt-PT"/>
+              </w:rPr>
+              <w:t>/</w:t>
             </w:r>
           </w:p>
         </w:tc>
@@ -2327,12 +2531,21 @@
               <w:spacing w:after="20" w:line="276" w:lineRule="auto"/>
               <w:ind w:firstLine="0"/>
             </w:pPr>
+            <w:proofErr w:type="spellStart"/>
             <w:r>
               <w:rPr>
                 <w:sz w:val="18"/>
                 <w:lang w:eastAsia="pt-PT" w:bidi="pt-PT"/>
               </w:rPr>
-              <w:t>includes/</w:t>
+              <w:t>includes</w:t>
+            </w:r>
+            <w:proofErr w:type="spellEnd"/>
+            <w:r>
+              <w:rPr>
+                <w:sz w:val="18"/>
+                <w:lang w:eastAsia="pt-PT" w:bidi="pt-PT"/>
+              </w:rPr>
+              <w:t>/</w:t>
             </w:r>
           </w:p>
         </w:tc>
@@ -2357,7 +2570,23 @@
                 <w:sz w:val="18"/>
                 <w:lang w:eastAsia="pt-PT" w:bidi="pt-PT"/>
               </w:rPr>
-              <w:t>Configuração, ligação à base de dados, autenticação, validação, helpers, traduções e funções comuns.</w:t>
+              <w:t xml:space="preserve">Configuração, ligação à base de dados, autenticação, validação, </w:t>
+            </w:r>
+            <w:proofErr w:type="spellStart"/>
+            <w:r>
+              <w:rPr>
+                <w:sz w:val="18"/>
+                <w:lang w:eastAsia="pt-PT" w:bidi="pt-PT"/>
+              </w:rPr>
+              <w:t>helpers</w:t>
+            </w:r>
+            <w:proofErr w:type="spellEnd"/>
+            <w:r>
+              <w:rPr>
+                <w:sz w:val="18"/>
+                <w:lang w:eastAsia="pt-PT" w:bidi="pt-PT"/>
+              </w:rPr>
+              <w:t>, traduções e funções comuns.</w:t>
             </w:r>
           </w:p>
         </w:tc>
@@ -2383,12 +2612,21 @@
               <w:spacing w:after="20" w:line="276" w:lineRule="auto"/>
               <w:ind w:firstLine="0"/>
             </w:pPr>
+            <w:proofErr w:type="spellStart"/>
             <w:r>
               <w:rPr>
                 <w:sz w:val="18"/>
                 <w:lang w:eastAsia="pt-PT" w:bidi="pt-PT"/>
               </w:rPr>
-              <w:t>pages/</w:t>
+              <w:t>pages</w:t>
+            </w:r>
+            <w:proofErr w:type="spellEnd"/>
+            <w:r>
+              <w:rPr>
+                <w:sz w:val="18"/>
+                <w:lang w:eastAsia="pt-PT" w:bidi="pt-PT"/>
+              </w:rPr>
+              <w:t>/</w:t>
             </w:r>
           </w:p>
         </w:tc>
@@ -2439,13 +2677,22 @@
               <w:spacing w:after="20" w:line="276" w:lineRule="auto"/>
               <w:ind w:firstLine="0"/>
             </w:pPr>
+            <w:proofErr w:type="spellStart"/>
             <w:r>
               <w:rPr>
                 <w:sz w:val="18"/>
                 <w:lang w:eastAsia="pt-PT" w:bidi="pt-PT"/>
               </w:rPr>
               <w:lastRenderedPageBreak/>
-              <w:t>vendor/</w:t>
+              <w:t>vendor</w:t>
+            </w:r>
+            <w:proofErr w:type="spellEnd"/>
+            <w:r>
+              <w:rPr>
+                <w:sz w:val="18"/>
+                <w:lang w:eastAsia="pt-PT" w:bidi="pt-PT"/>
+              </w:rPr>
+              <w:t>/</w:t>
             </w:r>
           </w:p>
         </w:tc>
@@ -2470,7 +2717,55 @@
                 <w:sz w:val="18"/>
                 <w:lang w:eastAsia="pt-PT" w:bidi="pt-PT"/>
               </w:rPr>
-              <w:t>Dependências instaladas por Composer, como PHPMailer e Dompdf.</w:t>
+              <w:t xml:space="preserve">Dependências instaladas por </w:t>
+            </w:r>
+            <w:proofErr w:type="spellStart"/>
+            <w:r>
+              <w:rPr>
+                <w:sz w:val="18"/>
+                <w:lang w:eastAsia="pt-PT" w:bidi="pt-PT"/>
+              </w:rPr>
+              <w:t>Composer</w:t>
+            </w:r>
+            <w:proofErr w:type="spellEnd"/>
+            <w:r>
+              <w:rPr>
+                <w:sz w:val="18"/>
+                <w:lang w:eastAsia="pt-PT" w:bidi="pt-PT"/>
+              </w:rPr>
+              <w:t xml:space="preserve">, como </w:t>
+            </w:r>
+            <w:proofErr w:type="spellStart"/>
+            <w:r>
+              <w:rPr>
+                <w:sz w:val="18"/>
+                <w:lang w:eastAsia="pt-PT" w:bidi="pt-PT"/>
+              </w:rPr>
+              <w:t>PHPMailer</w:t>
+            </w:r>
+            <w:proofErr w:type="spellEnd"/>
+            <w:r>
+              <w:rPr>
+                <w:sz w:val="18"/>
+                <w:lang w:eastAsia="pt-PT" w:bidi="pt-PT"/>
+              </w:rPr>
+              <w:t xml:space="preserve"> e </w:t>
+            </w:r>
+            <w:proofErr w:type="spellStart"/>
+            <w:r>
+              <w:rPr>
+                <w:sz w:val="18"/>
+                <w:lang w:eastAsia="pt-PT" w:bidi="pt-PT"/>
+              </w:rPr>
+              <w:t>Dompdf</w:t>
+            </w:r>
+            <w:proofErr w:type="spellEnd"/>
+            <w:r>
+              <w:rPr>
+                <w:sz w:val="18"/>
+                <w:lang w:eastAsia="pt-PT" w:bidi="pt-PT"/>
+              </w:rPr>
+              <w:t>.</w:t>
             </w:r>
           </w:p>
         </w:tc>
@@ -2496,12 +2791,21 @@
               <w:spacing w:after="20" w:line="276" w:lineRule="auto"/>
               <w:ind w:firstLine="0"/>
             </w:pPr>
+            <w:proofErr w:type="spellStart"/>
             <w:r>
               <w:rPr>
                 <w:sz w:val="18"/>
                 <w:lang w:eastAsia="pt-PT" w:bidi="pt-PT"/>
               </w:rPr>
-              <w:t>docs/</w:t>
+              <w:t>docs</w:t>
+            </w:r>
+            <w:proofErr w:type="spellEnd"/>
+            <w:r>
+              <w:rPr>
+                <w:sz w:val="18"/>
+                <w:lang w:eastAsia="pt-PT" w:bidi="pt-PT"/>
+              </w:rPr>
+              <w:t>/</w:t>
             </w:r>
           </w:p>
         </w:tc>
@@ -2552,6 +2856,7 @@
               <w:spacing w:after="20" w:line="276" w:lineRule="auto"/>
               <w:ind w:firstLine="0"/>
             </w:pPr>
+            <w:proofErr w:type="spellStart"/>
             <w:r>
               <w:rPr>
                 <w:sz w:val="18"/>
@@ -2559,6 +2864,7 @@
               </w:rPr>
               <w:t>greenerry.sql</w:t>
             </w:r>
+            <w:proofErr w:type="spellEnd"/>
           </w:p>
         </w:tc>
         <w:tc>
@@ -2582,7 +2888,23 @@
                 <w:sz w:val="18"/>
                 <w:lang w:eastAsia="pt-PT" w:bidi="pt-PT"/>
               </w:rPr>
-              <w:t>Script de importação/criação da base de dados Greenerry.</w:t>
+              <w:t xml:space="preserve">Script de importação/criação da base de dados </w:t>
+            </w:r>
+            <w:proofErr w:type="spellStart"/>
+            <w:r>
+              <w:rPr>
+                <w:sz w:val="18"/>
+                <w:lang w:eastAsia="pt-PT" w:bidi="pt-PT"/>
+              </w:rPr>
+              <w:t>Greenerry</w:t>
+            </w:r>
+            <w:proofErr w:type="spellEnd"/>
+            <w:r>
+              <w:rPr>
+                <w:sz w:val="18"/>
+                <w:lang w:eastAsia="pt-PT" w:bidi="pt-PT"/>
+              </w:rPr>
+              <w:t>.</w:t>
             </w:r>
           </w:p>
         </w:tc>
@@ -2608,6 +2930,8 @@
               <w:spacing w:after="20" w:line="276" w:lineRule="auto"/>
               <w:ind w:firstLine="0"/>
             </w:pPr>
+            <w:proofErr w:type="spellStart"/>
+            <w:proofErr w:type="gramStart"/>
             <w:r>
               <w:rPr>
                 <w:sz w:val="18"/>
@@ -2615,6 +2939,8 @@
               </w:rPr>
               <w:t>composer.json</w:t>
             </w:r>
+            <w:proofErr w:type="spellEnd"/>
+            <w:proofErr w:type="gramEnd"/>
           </w:p>
         </w:tc>
         <w:tc>
@@ -2662,30 +2988,81 @@
     <w:p>
       <w:pPr>
         <w:ind w:firstLine="709"/>
-        <w:jc w:val="left"/>
       </w:pPr>
       <w:r>
-        <w:t>Fluxo recomendado de instalação: iniciar Apache e MySQL no XAMPP, importar a base greenerry no phpMyAdmin, confirmar includes/config.php, abrir a homepage local, testar login de utilizador/artista e, por fim, abrir o URL reservado da administração.</w:t>
+        <w:t xml:space="preserve">Fluxo recomendado de instalação: iniciar Apache e </w:t>
+      </w:r>
+      <w:proofErr w:type="spellStart"/>
+      <w:r>
+        <w:t>MySQL</w:t>
+      </w:r>
+      <w:proofErr w:type="spellEnd"/>
+      <w:r>
+        <w:t xml:space="preserve"> no XAMPP, importar a base </w:t>
+      </w:r>
+      <w:proofErr w:type="spellStart"/>
+      <w:r>
+        <w:t>greenerry</w:t>
+      </w:r>
+      <w:proofErr w:type="spellEnd"/>
+      <w:r>
+        <w:t xml:space="preserve"> no </w:t>
+      </w:r>
+      <w:proofErr w:type="spellStart"/>
+      <w:r>
+        <w:t>phpMyAdmin</w:t>
+      </w:r>
+      <w:proofErr w:type="spellEnd"/>
+      <w:r>
+        <w:t xml:space="preserve">, confirmar </w:t>
+      </w:r>
+      <w:proofErr w:type="spellStart"/>
+      <w:r>
+        <w:t>includes</w:t>
+      </w:r>
+      <w:proofErr w:type="spellEnd"/>
+      <w:r>
+        <w:t>/</w:t>
+      </w:r>
+      <w:proofErr w:type="spellStart"/>
+      <w:r>
+        <w:t>config.php</w:t>
+      </w:r>
+      <w:proofErr w:type="spellEnd"/>
+      <w:r>
+        <w:t>, abrir a homepage local, testar login de utilizador/artista e, por fim, abrir o URL reservado da administração.</w:t>
       </w:r>
     </w:p>
     <w:p>
       <w:pPr>
         <w:pStyle w:val="ListBullet"/>
         <w:ind w:left="425" w:firstLine="709"/>
-        <w:jc w:val="left"/>
       </w:pPr>
       <w:r>
         <w:rPr>
           <w:lang w:eastAsia="pt-PT" w:bidi="pt-PT"/>
         </w:rPr>
-        <w:t>Copiar a pasta greenerry para C:\xampp\htdocs\dashboard\greenerry.</w:t>
+        <w:t xml:space="preserve">Copiar a pasta </w:t>
+      </w:r>
+      <w:proofErr w:type="spellStart"/>
+      <w:r>
+        <w:rPr>
+          <w:lang w:eastAsia="pt-PT" w:bidi="pt-PT"/>
+        </w:rPr>
+        <w:t>greenerry</w:t>
+      </w:r>
+      <w:proofErr w:type="spellEnd"/>
+      <w:r>
+        <w:rPr>
+          <w:lang w:eastAsia="pt-PT" w:bidi="pt-PT"/>
+        </w:rPr>
+        <w:t xml:space="preserve"> para C:\xampp\htdocs\dashboard\greenerry.</w:t>
       </w:r>
     </w:p>
     <w:p>
       <w:pPr>
         <w:pStyle w:val="ListBullet"/>
         <w:ind w:left="425" w:firstLine="709"/>
-        <w:jc w:val="left"/>
       </w:pPr>
       <w:r>
         <w:rPr>
@@ -2698,7 +3075,6 @@
       <w:pPr>
         <w:pStyle w:val="ListBullet"/>
         <w:ind w:left="425" w:firstLine="709"/>
-        <w:jc w:val="left"/>
       </w:pPr>
       <w:r>
         <w:rPr>
@@ -2711,59 +3087,166 @@
       <w:pPr>
         <w:pStyle w:val="ListBullet"/>
         <w:ind w:left="425" w:firstLine="709"/>
-        <w:jc w:val="left"/>
       </w:pPr>
       <w:r>
         <w:rPr>
           <w:lang w:eastAsia="pt-PT" w:bidi="pt-PT"/>
         </w:rPr>
-        <w:t>Iniciar MySQL/MariaDB.</w:t>
+        <w:t xml:space="preserve">Iniciar </w:t>
+      </w:r>
+      <w:proofErr w:type="spellStart"/>
+      <w:r>
+        <w:rPr>
+          <w:lang w:eastAsia="pt-PT" w:bidi="pt-PT"/>
+        </w:rPr>
+        <w:t>MySQL</w:t>
+      </w:r>
+      <w:proofErr w:type="spellEnd"/>
+      <w:r>
+        <w:rPr>
+          <w:lang w:eastAsia="pt-PT" w:bidi="pt-PT"/>
+        </w:rPr>
+        <w:t>/</w:t>
+      </w:r>
+      <w:proofErr w:type="spellStart"/>
+      <w:r>
+        <w:rPr>
+          <w:lang w:eastAsia="pt-PT" w:bidi="pt-PT"/>
+        </w:rPr>
+        <w:t>MariaDB</w:t>
+      </w:r>
+      <w:proofErr w:type="spellEnd"/>
+      <w:r>
+        <w:rPr>
+          <w:lang w:eastAsia="pt-PT" w:bidi="pt-PT"/>
+        </w:rPr>
+        <w:t>.</w:t>
       </w:r>
     </w:p>
     <w:p>
       <w:pPr>
         <w:pStyle w:val="ListBullet"/>
         <w:ind w:left="425" w:firstLine="709"/>
-        <w:jc w:val="left"/>
       </w:pPr>
       <w:r>
         <w:rPr>
           <w:lang w:eastAsia="pt-PT" w:bidi="pt-PT"/>
         </w:rPr>
-        <w:t>Abrir phpMyAdmin no navegador.</w:t>
+        <w:t xml:space="preserve">Abrir </w:t>
+      </w:r>
+      <w:proofErr w:type="spellStart"/>
+      <w:r>
+        <w:rPr>
+          <w:lang w:eastAsia="pt-PT" w:bidi="pt-PT"/>
+        </w:rPr>
+        <w:t>phpMyAdmin</w:t>
+      </w:r>
+      <w:proofErr w:type="spellEnd"/>
+      <w:r>
+        <w:rPr>
+          <w:lang w:eastAsia="pt-PT" w:bidi="pt-PT"/>
+        </w:rPr>
+        <w:t xml:space="preserve"> no navegador.</w:t>
       </w:r>
     </w:p>
     <w:p>
       <w:pPr>
         <w:pStyle w:val="ListBullet"/>
         <w:ind w:left="425" w:firstLine="709"/>
-        <w:jc w:val="left"/>
       </w:pPr>
       <w:r>
         <w:rPr>
           <w:lang w:eastAsia="pt-PT" w:bidi="pt-PT"/>
         </w:rPr>
-        <w:t>Criar a base de dados greenerry, caso ainda não exista.</w:t>
+        <w:t xml:space="preserve">Criar a base de dados </w:t>
+      </w:r>
+      <w:proofErr w:type="spellStart"/>
+      <w:r>
+        <w:rPr>
+          <w:lang w:eastAsia="pt-PT" w:bidi="pt-PT"/>
+        </w:rPr>
+        <w:t>greenerry</w:t>
+      </w:r>
+      <w:proofErr w:type="spellEnd"/>
+      <w:r>
+        <w:rPr>
+          <w:lang w:eastAsia="pt-PT" w:bidi="pt-PT"/>
+        </w:rPr>
+        <w:t>, caso ainda não exista.</w:t>
       </w:r>
     </w:p>
     <w:p>
       <w:pPr>
         <w:pStyle w:val="ListBullet"/>
         <w:ind w:left="425" w:firstLine="709"/>
-        <w:jc w:val="left"/>
       </w:pPr>
       <w:r>
         <w:rPr>
           <w:lang w:eastAsia="pt-PT" w:bidi="pt-PT"/>
         </w:rPr>
-        <w:t>Importar docs/PAP_ENTREGA/Anexo_Base_Dados/greenerry_base_dados_final.sql na base de dados greenerry.</w:t>
+        <w:t xml:space="preserve">Importar </w:t>
+      </w:r>
+      <w:proofErr w:type="spellStart"/>
+      <w:r>
+        <w:rPr>
+          <w:lang w:eastAsia="pt-PT" w:bidi="pt-PT"/>
+        </w:rPr>
+        <w:t>docs</w:t>
+      </w:r>
+      <w:proofErr w:type="spellEnd"/>
+      <w:r>
+        <w:rPr>
+          <w:lang w:eastAsia="pt-PT" w:bidi="pt-PT"/>
+        </w:rPr>
+        <w:t>/PAP_ENTREGA/</w:t>
+      </w:r>
+      <w:proofErr w:type="spellStart"/>
+      <w:r>
+        <w:rPr>
+          <w:lang w:eastAsia="pt-PT" w:bidi="pt-PT"/>
+        </w:rPr>
+        <w:t>Anexo_Base_Dados</w:t>
+      </w:r>
+      <w:proofErr w:type="spellEnd"/>
+      <w:r>
+        <w:rPr>
+          <w:lang w:eastAsia="pt-PT" w:bidi="pt-PT"/>
+        </w:rPr>
+        <w:t>/</w:t>
+      </w:r>
+      <w:proofErr w:type="spellStart"/>
+      <w:r>
+        <w:rPr>
+          <w:lang w:eastAsia="pt-PT" w:bidi="pt-PT"/>
+        </w:rPr>
+        <w:t>greenerry_base_dados_final.sql</w:t>
+      </w:r>
+      <w:proofErr w:type="spellEnd"/>
+      <w:r>
+        <w:rPr>
+          <w:lang w:eastAsia="pt-PT" w:bidi="pt-PT"/>
+        </w:rPr>
+        <w:t xml:space="preserve"> na base de dados </w:t>
+      </w:r>
+      <w:proofErr w:type="spellStart"/>
+      <w:r>
+        <w:rPr>
+          <w:lang w:eastAsia="pt-PT" w:bidi="pt-PT"/>
+        </w:rPr>
+        <w:t>greenerry</w:t>
+      </w:r>
+      <w:proofErr w:type="spellEnd"/>
+      <w:r>
+        <w:rPr>
+          <w:lang w:eastAsia="pt-PT" w:bidi="pt-PT"/>
+        </w:rPr>
+        <w:t>.</w:t>
       </w:r>
     </w:p>
     <w:p>
       <w:pPr>
         <w:pStyle w:val="ListBullet"/>
         <w:ind w:left="425" w:firstLine="709"/>
-        <w:jc w:val="left"/>
       </w:pPr>
       <w:r>
         <w:rPr>
@@ -2776,7 +3259,6 @@
       <w:pPr>
         <w:pStyle w:val="ListBullet"/>
         <w:ind w:left="425" w:firstLine="709"/>
-        <w:jc w:val="left"/>
       </w:pPr>
       <w:r>
         <w:rPr>
@@ -2896,6 +3378,7 @@
               <w:spacing w:after="20" w:line="276" w:lineRule="auto"/>
               <w:ind w:firstLine="0"/>
             </w:pPr>
+            <w:proofErr w:type="spellStart"/>
             <w:r>
               <w:rPr>
                 <w:sz w:val="18"/>
@@ -2903,6 +3386,7 @@
               </w:rPr>
               <w:t>Host</w:t>
             </w:r>
+            <w:proofErr w:type="spellEnd"/>
           </w:p>
         </w:tc>
         <w:tc>
@@ -2922,6 +3406,7 @@
               <w:ind w:firstLine="0"/>
               <w:jc w:val="center"/>
             </w:pPr>
+            <w:proofErr w:type="spellStart"/>
             <w:r>
               <w:rPr>
                 <w:sz w:val="18"/>
@@ -2929,6 +3414,7 @@
               </w:rPr>
               <w:t>localhost</w:t>
             </w:r>
+            <w:proofErr w:type="spellEnd"/>
           </w:p>
         </w:tc>
       </w:tr>
@@ -2958,8 +3444,17 @@
                 <w:sz w:val="18"/>
                 <w:lang w:eastAsia="pt-PT" w:bidi="pt-PT"/>
               </w:rPr>
-              <w:t>Utilizador MySQL</w:t>
-            </w:r>
+              <w:t xml:space="preserve">Utilizador </w:t>
+            </w:r>
+            <w:proofErr w:type="spellStart"/>
+            <w:r>
+              <w:rPr>
+                <w:sz w:val="18"/>
+                <w:lang w:eastAsia="pt-PT" w:bidi="pt-PT"/>
+              </w:rPr>
+              <w:t>MySQL</w:t>
+            </w:r>
+            <w:proofErr w:type="spellEnd"/>
           </w:p>
         </w:tc>
         <w:tc>
@@ -2979,6 +3474,7 @@
               <w:ind w:firstLine="0"/>
               <w:jc w:val="center"/>
             </w:pPr>
+            <w:proofErr w:type="spellStart"/>
             <w:r>
               <w:rPr>
                 <w:sz w:val="18"/>
@@ -2986,6 +3482,7 @@
               </w:rPr>
               <w:t>root</w:t>
             </w:r>
+            <w:proofErr w:type="spellEnd"/>
           </w:p>
         </w:tc>
       </w:tr>
@@ -3014,8 +3511,16 @@
               <w:rPr>
                 <w:sz w:val="18"/>
               </w:rPr>
-              <w:t>Palavra-passe MySQL</w:t>
-            </w:r>
+              <w:t xml:space="preserve">Palavra-passe </w:t>
+            </w:r>
+            <w:proofErr w:type="spellStart"/>
+            <w:r>
+              <w:rPr>
+                <w:sz w:val="18"/>
+              </w:rPr>
+              <w:t>MySQL</w:t>
+            </w:r>
+            <w:proofErr w:type="spellEnd"/>
           </w:p>
         </w:tc>
         <w:tc>
@@ -3092,6 +3597,7 @@
               <w:ind w:firstLine="0"/>
               <w:jc w:val="center"/>
             </w:pPr>
+            <w:proofErr w:type="spellStart"/>
             <w:r>
               <w:rPr>
                 <w:sz w:val="18"/>
@@ -3099,6 +3605,7 @@
               </w:rPr>
               <w:t>greenerry</w:t>
             </w:r>
+            <w:proofErr w:type="spellEnd"/>
           </w:p>
         </w:tc>
       </w:tr>
@@ -3149,13 +3656,31 @@
               <w:ind w:firstLine="0"/>
               <w:jc w:val="center"/>
             </w:pPr>
+            <w:proofErr w:type="spellStart"/>
             <w:r>
               <w:rPr>
                 <w:sz w:val="18"/>
                 <w:lang w:eastAsia="pt-PT" w:bidi="pt-PT"/>
               </w:rPr>
-              <w:t>includes/config.php</w:t>
-            </w:r>
+              <w:t>includes</w:t>
+            </w:r>
+            <w:proofErr w:type="spellEnd"/>
+            <w:r>
+              <w:rPr>
+                <w:sz w:val="18"/>
+                <w:lang w:eastAsia="pt-PT" w:bidi="pt-PT"/>
+              </w:rPr>
+              <w:t>/</w:t>
+            </w:r>
+            <w:proofErr w:type="spellStart"/>
+            <w:r>
+              <w:rPr>
+                <w:sz w:val="18"/>
+                <w:lang w:eastAsia="pt-PT" w:bidi="pt-PT"/>
+              </w:rPr>
+              <w:t>config.php</w:t>
+            </w:r>
+            <w:proofErr w:type="spellEnd"/>
           </w:p>
         </w:tc>
       </w:tr>
@@ -3340,6 +3865,7 @@
               <w:spacing w:after="20" w:line="276" w:lineRule="auto"/>
               <w:ind w:firstLine="0"/>
             </w:pPr>
+            <w:proofErr w:type="spellStart"/>
             <w:r>
               <w:rPr>
                 <w:sz w:val="18"/>
@@ -3347,6 +3873,7 @@
               </w:rPr>
               <w:t>PHPMailer</w:t>
             </w:r>
+            <w:proofErr w:type="spellEnd"/>
           </w:p>
         </w:tc>
         <w:tc>
@@ -3396,6 +3923,7 @@
               <w:spacing w:after="20" w:line="276" w:lineRule="auto"/>
               <w:ind w:firstLine="0"/>
             </w:pPr>
+            <w:proofErr w:type="spellStart"/>
             <w:r>
               <w:rPr>
                 <w:sz w:val="18"/>
@@ -3403,6 +3931,7 @@
               </w:rPr>
               <w:t>Dompdf</w:t>
             </w:r>
+            <w:proofErr w:type="spellEnd"/>
           </w:p>
         </w:tc>
         <w:tc>
@@ -3452,6 +3981,7 @@
               <w:spacing w:after="20" w:line="276" w:lineRule="auto"/>
               <w:ind w:firstLine="0"/>
             </w:pPr>
+            <w:proofErr w:type="spellStart"/>
             <w:r>
               <w:rPr>
                 <w:sz w:val="18"/>
@@ -3459,6 +3989,7 @@
               </w:rPr>
               <w:t>Composer</w:t>
             </w:r>
+            <w:proofErr w:type="spellEnd"/>
           </w:p>
         </w:tc>
         <w:tc>
@@ -3482,7 +4013,25 @@
                 <w:sz w:val="18"/>
                 <w:lang w:eastAsia="pt-PT" w:bidi="pt-PT"/>
               </w:rPr>
-              <w:t>Gestão das dependências PHP através do ficheiro composer.json.</w:t>
+              <w:t xml:space="preserve">Gestão das dependências PHP através do ficheiro </w:t>
+            </w:r>
+            <w:proofErr w:type="spellStart"/>
+            <w:proofErr w:type="gramStart"/>
+            <w:r>
+              <w:rPr>
+                <w:sz w:val="18"/>
+                <w:lang w:eastAsia="pt-PT" w:bidi="pt-PT"/>
+              </w:rPr>
+              <w:t>composer.json</w:t>
+            </w:r>
+            <w:proofErr w:type="spellEnd"/>
+            <w:proofErr w:type="gramEnd"/>
+            <w:r>
+              <w:rPr>
+                <w:sz w:val="18"/>
+                <w:lang w:eastAsia="pt-PT" w:bidi="pt-PT"/>
+              </w:rPr>
+              <w:t>.</w:t>
             </w:r>
           </w:p>
         </w:tc>
@@ -3497,7 +4046,77 @@
         <w:rPr>
           <w:lang w:eastAsia="pt-PT" w:bidi="pt-PT"/>
         </w:rPr>
-        <w:t>Se a pasta vendor não existir, deve ser executado o comando composer install na raiz do projeto. Depois da instalação, deve ser confirmado que o ficheiro vendor/autoload.php existe.</w:t>
+        <w:t xml:space="preserve">Se a pasta </w:t>
+      </w:r>
+      <w:proofErr w:type="spellStart"/>
+      <w:r>
+        <w:rPr>
+          <w:lang w:eastAsia="pt-PT" w:bidi="pt-PT"/>
+        </w:rPr>
+        <w:t>vendor</w:t>
+      </w:r>
+      <w:proofErr w:type="spellEnd"/>
+      <w:r>
+        <w:rPr>
+          <w:lang w:eastAsia="pt-PT" w:bidi="pt-PT"/>
+        </w:rPr>
+        <w:t xml:space="preserve"> não existir, deve ser executado o comando </w:t>
+      </w:r>
+      <w:proofErr w:type="spellStart"/>
+      <w:r>
+        <w:rPr>
+          <w:lang w:eastAsia="pt-PT" w:bidi="pt-PT"/>
+        </w:rPr>
+        <w:t>composer</w:t>
+      </w:r>
+      <w:proofErr w:type="spellEnd"/>
+      <w:r>
+        <w:rPr>
+          <w:lang w:eastAsia="pt-PT" w:bidi="pt-PT"/>
+        </w:rPr>
+        <w:t xml:space="preserve"> </w:t>
+      </w:r>
+      <w:proofErr w:type="spellStart"/>
+      <w:r>
+        <w:rPr>
+          <w:lang w:eastAsia="pt-PT" w:bidi="pt-PT"/>
+        </w:rPr>
+        <w:t>install</w:t>
+      </w:r>
+      <w:proofErr w:type="spellEnd"/>
+      <w:r>
+        <w:rPr>
+          <w:lang w:eastAsia="pt-PT" w:bidi="pt-PT"/>
+        </w:rPr>
+        <w:t xml:space="preserve"> na raiz do projeto. Depois da instalação, deve ser confirmado que o ficheiro </w:t>
+      </w:r>
+      <w:proofErr w:type="spellStart"/>
+      <w:r>
+        <w:rPr>
+          <w:lang w:eastAsia="pt-PT" w:bidi="pt-PT"/>
+        </w:rPr>
+        <w:t>vendor</w:t>
+      </w:r>
+      <w:proofErr w:type="spellEnd"/>
+      <w:r>
+        <w:rPr>
+          <w:lang w:eastAsia="pt-PT" w:bidi="pt-PT"/>
+        </w:rPr>
+        <w:t>/</w:t>
+      </w:r>
+      <w:proofErr w:type="spellStart"/>
+      <w:r>
+        <w:rPr>
+          <w:lang w:eastAsia="pt-PT" w:bidi="pt-PT"/>
+        </w:rPr>
+        <w:t>autoload.php</w:t>
+      </w:r>
+      <w:proofErr w:type="spellEnd"/>
+      <w:r>
+        <w:rPr>
+          <w:lang w:eastAsia="pt-PT" w:bidi="pt-PT"/>
+        </w:rPr>
+        <w:t xml:space="preserve"> existe.</w:t>
       </w:r>
     </w:p>
     <w:p>
@@ -3518,10 +4137,33 @@
     <w:p>
       <w:pPr>
         <w:ind w:firstLine="709"/>
-        <w:jc w:val="left"/>
       </w:pPr>
       <w:r>
-        <w:t>A administração não é acedida pelo formulário público de utilizador/artista. Para testar a área administrativa deve ser usado o URL reservado http://localhost/dashboard/greenerry/admin/login.php. A conta greenerry333@gmail.com representa a super administração para a demonstração; outras contas admin ficam registadas na tabela admin e dependem de permissões ativas.</w:t>
+        <w:t xml:space="preserve">A administração não é acedida pelo formulário público de utilizador/artista. Para testar a área administrativa deve ser usado o URL reservado http://localhost/dashboard/greenerry/admin/login.php. A conta greenerry333@gmail.com representa a </w:t>
+      </w:r>
+      <w:proofErr w:type="spellStart"/>
+      <w:r>
+        <w:t>super</w:t>
+      </w:r>
+      <w:proofErr w:type="spellEnd"/>
+      <w:r>
+        <w:t xml:space="preserve"> administração para a demonstração; outras contas </w:t>
+      </w:r>
+      <w:proofErr w:type="spellStart"/>
+      <w:r>
+        <w:t>admin</w:t>
+      </w:r>
+      <w:proofErr w:type="spellEnd"/>
+      <w:r>
+        <w:t xml:space="preserve"> ficam registadas na tabela </w:t>
+      </w:r>
+      <w:proofErr w:type="spellStart"/>
+      <w:r>
+        <w:t>admin</w:t>
+      </w:r>
+      <w:proofErr w:type="spellEnd"/>
+      <w:r>
+        <w:t xml:space="preserve"> e dependem de permissões ativas.</w:t>
       </w:r>
     </w:p>
     <w:tbl>
@@ -3641,7 +4283,23 @@
           </w:tcPr>
           <w:p>
             <w:r>
-              <w:t>E-mail: greenerry333@gmail.com | Palavra-passe: Srijan123@ | Conta super admin usada para demonstração e gestão completa.</w:t>
+              <w:t xml:space="preserve">E-mail: greenerry333@gmail.com | Palavra-passe: Srijan123@ | Conta </w:t>
+            </w:r>
+            <w:proofErr w:type="spellStart"/>
+            <w:r>
+              <w:t>super</w:t>
+            </w:r>
+            <w:proofErr w:type="spellEnd"/>
+            <w:r>
+              <w:t xml:space="preserve"> </w:t>
+            </w:r>
+            <w:proofErr w:type="spellStart"/>
+            <w:r>
+              <w:t>admin</w:t>
+            </w:r>
+            <w:proofErr w:type="spellEnd"/>
+            <w:r>
+              <w:t xml:space="preserve"> usada para demonstração e gestão completa.</w:t>
             </w:r>
           </w:p>
         </w:tc>
@@ -3736,7 +4394,15 @@
           </w:tcPr>
           <w:p>
             <w:r>
-              <w:t>Não existe campo adicional no login público. A permissão vem da tabela admin e da sessão administrativa.</w:t>
+              <w:t xml:space="preserve">Não existe campo adicional no login público. A permissão vem da tabela </w:t>
+            </w:r>
+            <w:proofErr w:type="spellStart"/>
+            <w:r>
+              <w:t>admin</w:t>
+            </w:r>
+            <w:proofErr w:type="spellEnd"/>
+            <w:r>
+              <w:t xml:space="preserve"> e da sessão administrativa.</w:t>
             </w:r>
           </w:p>
         </w:tc>
@@ -3791,7 +4457,35 @@
               <w:rPr>
                 <w:sz w:val="19"/>
               </w:rPr>
-              <w:t>Confirmar que a base de dados greenerry foi criada e importada no phpMyAdmin. Usar o ficheiro docs/PAP_ENTREGA/Anexo_Base_Dados/greenerry_base_dados_final.sql.</w:t>
+              <w:t xml:space="preserve">Confirmar que a base de dados </w:t>
+            </w:r>
+            <w:proofErr w:type="spellStart"/>
+            <w:r>
+              <w:rPr>
+                <w:sz w:val="19"/>
+              </w:rPr>
+              <w:t>greenerry</w:t>
+            </w:r>
+            <w:proofErr w:type="spellEnd"/>
+            <w:r>
+              <w:rPr>
+                <w:sz w:val="19"/>
+              </w:rPr>
+              <w:t xml:space="preserve"> foi criada e importada no </w:t>
+            </w:r>
+            <w:proofErr w:type="spellStart"/>
+            <w:r>
+              <w:rPr>
+                <w:sz w:val="19"/>
+              </w:rPr>
+              <w:t>phpMyAdmin</w:t>
+            </w:r>
+            <w:proofErr w:type="spellEnd"/>
+            <w:r>
+              <w:rPr>
+                <w:sz w:val="19"/>
+              </w:rPr>
+              <w:t>. Usar o ficheiro docs/PAP_ENTREGA/Anexo_Base_Dados/greenerry_base_dados_final.sql.</w:t>
             </w:r>
           </w:p>
         </w:tc>
@@ -3816,7 +4510,6 @@
       <w:pPr>
         <w:pStyle w:val="ListBullet"/>
         <w:ind w:left="425" w:firstLine="709"/>
-        <w:jc w:val="left"/>
       </w:pPr>
       <w:r>
         <w:rPr>
@@ -3829,20 +4522,32 @@
       <w:pPr>
         <w:pStyle w:val="ListBullet"/>
         <w:ind w:left="425" w:firstLine="709"/>
-        <w:jc w:val="left"/>
       </w:pPr>
       <w:r>
         <w:rPr>
           <w:lang w:eastAsia="pt-PT" w:bidi="pt-PT"/>
         </w:rPr>
-        <w:t>Palavras-passe guardadas com hash.</w:t>
+        <w:t xml:space="preserve">Palavras-passe guardadas com </w:t>
+      </w:r>
+      <w:proofErr w:type="spellStart"/>
+      <w:r>
+        <w:rPr>
+          <w:lang w:eastAsia="pt-PT" w:bidi="pt-PT"/>
+        </w:rPr>
+        <w:t>hash</w:t>
+      </w:r>
+      <w:proofErr w:type="spellEnd"/>
+      <w:r>
+        <w:rPr>
+          <w:lang w:eastAsia="pt-PT" w:bidi="pt-PT"/>
+        </w:rPr>
+        <w:t>.</w:t>
       </w:r>
     </w:p>
     <w:p>
       <w:pPr>
         <w:pStyle w:val="ListBullet"/>
         <w:ind w:left="425" w:firstLine="709"/>
-        <w:jc w:val="left"/>
       </w:pPr>
       <w:r>
         <w:rPr>
@@ -3855,20 +4560,26 @@
       <w:pPr>
         <w:pStyle w:val="ListBullet"/>
         <w:ind w:left="425" w:firstLine="709"/>
-        <w:jc w:val="left"/>
       </w:pPr>
+      <w:proofErr w:type="spellStart"/>
       <w:r>
         <w:rPr>
           <w:lang w:eastAsia="pt-PT" w:bidi="pt-PT"/>
         </w:rPr>
-        <w:t>Tokens CSRF em formulários.</w:t>
+        <w:t>Tokens</w:t>
+      </w:r>
+      <w:proofErr w:type="spellEnd"/>
+      <w:r>
+        <w:rPr>
+          <w:lang w:eastAsia="pt-PT" w:bidi="pt-PT"/>
+        </w:rPr>
+        <w:t xml:space="preserve"> CSRF em formulários.</w:t>
       </w:r>
     </w:p>
     <w:p>
       <w:pPr>
         <w:pStyle w:val="ListBullet"/>
         <w:ind w:left="425" w:firstLine="709"/>
-        <w:jc w:val="left"/>
       </w:pPr>
       <w:r>
         <w:rPr>
@@ -3881,7 +4592,6 @@
       <w:pPr>
         <w:pStyle w:val="ListBullet"/>
         <w:ind w:left="425" w:firstLine="709"/>
-        <w:jc w:val="left"/>
       </w:pPr>
       <w:r>
         <w:rPr>
@@ -3894,7 +4604,6 @@
       <w:pPr>
         <w:pStyle w:val="ListBullet"/>
         <w:ind w:left="425" w:firstLine="709"/>
-        <w:jc w:val="left"/>
       </w:pPr>
       <w:r>
         <w:rPr>
@@ -3907,7 +4616,6 @@
       <w:pPr>
         <w:pStyle w:val="ListBullet"/>
         <w:ind w:left="425" w:firstLine="709"/>
-        <w:jc w:val="left"/>
       </w:pPr>
       <w:r>
         <w:rPr>
@@ -3920,7 +4628,6 @@
       <w:pPr>
         <w:pStyle w:val="ListBullet"/>
         <w:ind w:left="425" w:firstLine="709"/>
-        <w:jc w:val="left"/>
       </w:pPr>
       <w:r>
         <w:rPr>
@@ -3933,7 +4640,6 @@
       <w:pPr>
         <w:pStyle w:val="ListBullet"/>
         <w:ind w:left="425" w:firstLine="709"/>
-        <w:jc w:val="left"/>
       </w:pPr>
       <w:r>
         <w:rPr>
@@ -3946,7 +4652,6 @@
       <w:pPr>
         <w:pStyle w:val="ListBullet"/>
         <w:ind w:left="425" w:firstLine="709"/>
-        <w:jc w:val="left"/>
       </w:pPr>
       <w:r>
         <w:rPr>
@@ -3959,7 +4664,6 @@
       <w:pPr>
         <w:pStyle w:val="ListBullet"/>
         <w:ind w:left="425" w:firstLine="709"/>
-        <w:jc w:val="left"/>
       </w:pPr>
       <w:r>
         <w:rPr>
@@ -4687,6 +5391,7 @@
               <w:spacing w:after="20" w:line="276" w:lineRule="auto"/>
               <w:ind w:firstLine="0"/>
             </w:pPr>
+            <w:proofErr w:type="spellStart"/>
             <w:r>
               <w:rPr>
                 <w:sz w:val="18"/>
@@ -4694,6 +5399,7 @@
               </w:rPr>
               <w:t>Admin</w:t>
             </w:r>
+            <w:proofErr w:type="spellEnd"/>
           </w:p>
         </w:tc>
         <w:tc>
@@ -4773,7 +5479,39 @@
                 <w:sz w:val="18"/>
                 <w:lang w:eastAsia="pt-PT" w:bidi="pt-PT"/>
               </w:rPr>
-              <w:t>Verificar tema claro/escuro, mobile/desktop e logótipo em sidebar/header.</w:t>
+              <w:t xml:space="preserve">Verificar tema claro/escuro, mobile/desktop e logótipo em </w:t>
+            </w:r>
+            <w:proofErr w:type="spellStart"/>
+            <w:r>
+              <w:rPr>
+                <w:sz w:val="18"/>
+                <w:lang w:eastAsia="pt-PT" w:bidi="pt-PT"/>
+              </w:rPr>
+              <w:t>sidebar</w:t>
+            </w:r>
+            <w:proofErr w:type="spellEnd"/>
+            <w:r>
+              <w:rPr>
+                <w:sz w:val="18"/>
+                <w:lang w:eastAsia="pt-PT" w:bidi="pt-PT"/>
+              </w:rPr>
+              <w:t>/</w:t>
+            </w:r>
+            <w:proofErr w:type="spellStart"/>
+            <w:r>
+              <w:rPr>
+                <w:sz w:val="18"/>
+                <w:lang w:eastAsia="pt-PT" w:bidi="pt-PT"/>
+              </w:rPr>
+              <w:t>header</w:t>
+            </w:r>
+            <w:proofErr w:type="spellEnd"/>
+            <w:r>
+              <w:rPr>
+                <w:sz w:val="18"/>
+                <w:lang w:eastAsia="pt-PT" w:bidi="pt-PT"/>
+              </w:rPr>
+              <w:t>.</w:t>
             </w:r>
           </w:p>
         </w:tc>
@@ -4974,7 +5712,49 @@
               <w:rPr>
                 <w:sz w:val="19"/>
               </w:rPr>
-              <w:t>Confirmar no phpMyAdmin que a base greenerry existe e que o ficheiro final da pasta Anexo_Base_Dados foi importado.</w:t>
+              <w:t xml:space="preserve">Confirmar no </w:t>
+            </w:r>
+            <w:proofErr w:type="spellStart"/>
+            <w:r>
+              <w:rPr>
+                <w:sz w:val="19"/>
+              </w:rPr>
+              <w:t>phpMyAdmin</w:t>
+            </w:r>
+            <w:proofErr w:type="spellEnd"/>
+            <w:r>
+              <w:rPr>
+                <w:sz w:val="19"/>
+              </w:rPr>
+              <w:t xml:space="preserve"> que a base </w:t>
+            </w:r>
+            <w:proofErr w:type="spellStart"/>
+            <w:r>
+              <w:rPr>
+                <w:sz w:val="19"/>
+              </w:rPr>
+              <w:t>greenerry</w:t>
+            </w:r>
+            <w:proofErr w:type="spellEnd"/>
+            <w:r>
+              <w:rPr>
+                <w:sz w:val="19"/>
+              </w:rPr>
+              <w:t xml:space="preserve"> existe e que o ficheiro final da pasta </w:t>
+            </w:r>
+            <w:proofErr w:type="spellStart"/>
+            <w:r>
+              <w:rPr>
+                <w:sz w:val="19"/>
+              </w:rPr>
+              <w:t>Anexo_Base_Dados</w:t>
+            </w:r>
+            <w:proofErr w:type="spellEnd"/>
+            <w:r>
+              <w:rPr>
+                <w:sz w:val="19"/>
+              </w:rPr>
+              <w:t xml:space="preserve"> foi importado.</w:t>
             </w:r>
           </w:p>
         </w:tc>
@@ -5030,7 +5810,71 @@
                 <w:sz w:val="18"/>
                 <w:lang w:eastAsia="pt-PT" w:bidi="pt-PT"/>
               </w:rPr>
-              <w:t>Executar composer install e confirmar vendor/autoload.php.</w:t>
+              <w:t xml:space="preserve">Executar </w:t>
+            </w:r>
+            <w:proofErr w:type="spellStart"/>
+            <w:r>
+              <w:rPr>
+                <w:sz w:val="18"/>
+                <w:lang w:eastAsia="pt-PT" w:bidi="pt-PT"/>
+              </w:rPr>
+              <w:t>composer</w:t>
+            </w:r>
+            <w:proofErr w:type="spellEnd"/>
+            <w:r>
+              <w:rPr>
+                <w:sz w:val="18"/>
+                <w:lang w:eastAsia="pt-PT" w:bidi="pt-PT"/>
+              </w:rPr>
+              <w:t xml:space="preserve"> </w:t>
+            </w:r>
+            <w:proofErr w:type="spellStart"/>
+            <w:r>
+              <w:rPr>
+                <w:sz w:val="18"/>
+                <w:lang w:eastAsia="pt-PT" w:bidi="pt-PT"/>
+              </w:rPr>
+              <w:t>install</w:t>
+            </w:r>
+            <w:proofErr w:type="spellEnd"/>
+            <w:r>
+              <w:rPr>
+                <w:sz w:val="18"/>
+                <w:lang w:eastAsia="pt-PT" w:bidi="pt-PT"/>
+              </w:rPr>
+              <w:t xml:space="preserve"> e confirmar </w:t>
+            </w:r>
+            <w:proofErr w:type="spellStart"/>
+            <w:r>
+              <w:rPr>
+                <w:sz w:val="18"/>
+                <w:lang w:eastAsia="pt-PT" w:bidi="pt-PT"/>
+              </w:rPr>
+              <w:t>vendor</w:t>
+            </w:r>
+            <w:proofErr w:type="spellEnd"/>
+            <w:r>
+              <w:rPr>
+                <w:sz w:val="18"/>
+                <w:lang w:eastAsia="pt-PT" w:bidi="pt-PT"/>
+              </w:rPr>
+              <w:t>/</w:t>
+            </w:r>
+            <w:proofErr w:type="spellStart"/>
+            <w:r>
+              <w:rPr>
+                <w:sz w:val="18"/>
+                <w:lang w:eastAsia="pt-PT" w:bidi="pt-PT"/>
+              </w:rPr>
+              <w:t>autoload.php</w:t>
+            </w:r>
+            <w:proofErr w:type="spellEnd"/>
+            <w:r>
+              <w:rPr>
+                <w:sz w:val="18"/>
+                <w:lang w:eastAsia="pt-PT" w:bidi="pt-PT"/>
+              </w:rPr>
+              <w:t>.</w:t>
             </w:r>
           </w:p>
         </w:tc>
@@ -5142,7 +5986,23 @@
                 <w:sz w:val="18"/>
                 <w:lang w:eastAsia="pt-PT" w:bidi="pt-PT"/>
               </w:rPr>
-              <w:t>Confirmar caminhos dentro de assets/ e permissões de leitura.</w:t>
+              <w:t xml:space="preserve">Confirmar caminhos dentro de </w:t>
+            </w:r>
+            <w:proofErr w:type="spellStart"/>
+            <w:r>
+              <w:rPr>
+                <w:sz w:val="18"/>
+                <w:lang w:eastAsia="pt-PT" w:bidi="pt-PT"/>
+              </w:rPr>
+              <w:t>assets</w:t>
+            </w:r>
+            <w:proofErr w:type="spellEnd"/>
+            <w:r>
+              <w:rPr>
+                <w:sz w:val="18"/>
+                <w:lang w:eastAsia="pt-PT" w:bidi="pt-PT"/>
+              </w:rPr>
+              <w:t>/ e permissões de leitura.</w:t>
             </w:r>
           </w:p>
         </w:tc>
@@ -5168,12 +6028,21 @@
               <w:spacing w:after="20" w:line="276" w:lineRule="auto"/>
               <w:ind w:firstLine="0"/>
             </w:pPr>
+            <w:proofErr w:type="spellStart"/>
             <w:r>
               <w:rPr>
                 <w:sz w:val="18"/>
                 <w:lang w:eastAsia="pt-PT" w:bidi="pt-PT"/>
               </w:rPr>
-              <w:t>Admin não entra</w:t>
+              <w:t>Admin</w:t>
+            </w:r>
+            <w:proofErr w:type="spellEnd"/>
+            <w:r>
+              <w:rPr>
+                <w:sz w:val="18"/>
+                <w:lang w:eastAsia="pt-PT" w:bidi="pt-PT"/>
+              </w:rPr>
+              <w:t xml:space="preserve"> não entra</w:t>
             </w:r>
           </w:p>
         </w:tc>
@@ -5197,7 +6066,21 @@
               <w:rPr>
                 <w:sz w:val="18"/>
               </w:rPr>
-              <w:t>Confirmar conta ativa na tabela admin, e-mail correto, palavra-passe correta e uso do URL reservado http://localhost/dashboard/greenerry/admin/login.php.</w:t>
+              <w:t xml:space="preserve">Confirmar conta ativa na tabela </w:t>
+            </w:r>
+            <w:proofErr w:type="spellStart"/>
+            <w:r>
+              <w:rPr>
+                <w:sz w:val="18"/>
+              </w:rPr>
+              <w:t>admin</w:t>
+            </w:r>
+            <w:proofErr w:type="spellEnd"/>
+            <w:r>
+              <w:rPr>
+                <w:sz w:val="18"/>
+              </w:rPr>
+              <w:t>, e-mail correto, palavra-passe correta e uso do URL reservado http://localhost/dashboard/greenerry/admin/login.php.</w:t>
             </w:r>
           </w:p>
         </w:tc>
@@ -5407,11 +6290,19 @@
               <w:spacing w:after="20" w:line="276" w:lineRule="auto"/>
               <w:ind w:firstLine="0"/>
             </w:pPr>
+            <w:proofErr w:type="spellStart"/>
             <w:r>
               <w:rPr>
                 <w:sz w:val="18"/>
               </w:rPr>
-              <w:t>docs/PAP_ENTREGA/Manual_Tecnico_Greenerry_Srijan_Gautam.docx</w:t>
+              <w:t>docs</w:t>
+            </w:r>
+            <w:proofErr w:type="spellEnd"/>
+            <w:r>
+              <w:rPr>
+                <w:sz w:val="18"/>
+              </w:rPr>
+              <w:t>/PAP_ENTREGA/Manual_Tecnico_Greenerry_Srijan_Gautam.docx</w:t>
             </w:r>
           </w:p>
         </w:tc>
@@ -5462,11 +6353,19 @@
               <w:spacing w:after="20" w:line="276" w:lineRule="auto"/>
               <w:ind w:firstLine="0"/>
             </w:pPr>
+            <w:proofErr w:type="spellStart"/>
             <w:r>
               <w:rPr>
                 <w:sz w:val="18"/>
               </w:rPr>
-              <w:t>docs/PAP_ENTREGA/DER_GREENERRY.pdf</w:t>
+              <w:t>docs</w:t>
+            </w:r>
+            <w:proofErr w:type="spellEnd"/>
+            <w:r>
+              <w:rPr>
+                <w:sz w:val="18"/>
+              </w:rPr>
+              <w:t>/PAP_ENTREGA/DER_GREENERRY.pdf</w:t>
             </w:r>
           </w:p>
         </w:tc>
@@ -5575,12 +6474,42 @@
             <w:pPr>
               <w:spacing w:after="0" w:line="276" w:lineRule="auto"/>
             </w:pPr>
+            <w:proofErr w:type="spellStart"/>
             <w:r>
               <w:rPr>
                 <w:sz w:val="19"/>
               </w:rPr>
-              <w:t>docs/PAP_ENTREGA/Anexo_Base_Dados/ greenerry_base_dados_final.sql</w:t>
-            </w:r>
+              <w:t>docs</w:t>
+            </w:r>
+            <w:proofErr w:type="spellEnd"/>
+            <w:r>
+              <w:rPr>
+                <w:sz w:val="19"/>
+              </w:rPr>
+              <w:t>/PAP_ENTREGA/</w:t>
+            </w:r>
+            <w:proofErr w:type="spellStart"/>
+            <w:r>
+              <w:rPr>
+                <w:sz w:val="19"/>
+              </w:rPr>
+              <w:t>Anexo_Base_Dados</w:t>
+            </w:r>
+            <w:proofErr w:type="spellEnd"/>
+            <w:r>
+              <w:rPr>
+                <w:sz w:val="19"/>
+              </w:rPr>
+              <w:t xml:space="preserve">/ </w:t>
+            </w:r>
+            <w:proofErr w:type="spellStart"/>
+            <w:r>
+              <w:rPr>
+                <w:sz w:val="19"/>
+              </w:rPr>
+              <w:t>greenerry_base_dados_final.sql</w:t>
+            </w:r>
+            <w:proofErr w:type="spellEnd"/>
           </w:p>
         </w:tc>
       </w:tr>
@@ -5630,11 +6559,33 @@
               <w:spacing w:after="20" w:line="276" w:lineRule="auto"/>
               <w:ind w:firstLine="0"/>
             </w:pPr>
+            <w:proofErr w:type="spellStart"/>
             <w:r>
               <w:rPr>
                 <w:sz w:val="18"/>
               </w:rPr>
-              <w:t>docs/PAP_ENTREGA/Anexos_Capturas_Plataforma/</w:t>
+              <w:t>docs</w:t>
+            </w:r>
+            <w:proofErr w:type="spellEnd"/>
+            <w:r>
+              <w:rPr>
+                <w:sz w:val="18"/>
+              </w:rPr>
+              <w:t>/PAP_ENTREGA/</w:t>
+            </w:r>
+            <w:proofErr w:type="spellStart"/>
+            <w:r>
+              <w:rPr>
+                <w:sz w:val="18"/>
+              </w:rPr>
+              <w:t>Anexos_Capturas_Plataforma</w:t>
+            </w:r>
+            <w:proofErr w:type="spellEnd"/>
+            <w:r>
+              <w:rPr>
+                <w:sz w:val="18"/>
+              </w:rPr>
+              <w:t>/</w:t>
             </w:r>
           </w:p>
         </w:tc>
@@ -5681,8 +6632,21 @@
             <w:vAlign w:val="center"/>
           </w:tcPr>
           <w:p>
-            <w:r>
-              <w:t>docs/PAP_ENTREGA/Anexo_Video_PAP/</w:t>
+            <w:proofErr w:type="spellStart"/>
+            <w:r>
+              <w:t>docs</w:t>
+            </w:r>
+            <w:proofErr w:type="spellEnd"/>
+            <w:r>
+              <w:t>/PAP_ENTREGA/</w:t>
+            </w:r>
+            <w:proofErr w:type="spellStart"/>
+            <w:r>
+              <w:t>Anexo_Video_PAP</w:t>
+            </w:r>
+            <w:proofErr w:type="spellEnd"/>
+            <w:r>
+              <w:t>/</w:t>
             </w:r>
           </w:p>
         </w:tc>
@@ -5712,7 +6676,21 @@
         <w:rPr>
           <w:lang w:eastAsia="pt-PT" w:bidi="pt-PT"/>
         </w:rPr>
-        <w:t>As figuras seguintes comprovam pontos técnicos importantes: URL reservado da administração, painel administrativo com dados carregados, relatório financeiro e organização da base de dados no phpMyAdmin Designer.</w:t>
+        <w:t xml:space="preserve">As figuras seguintes comprovam pontos técnicos importantes: URL reservado da administração, painel administrativo com dados carregados, relatório financeiro e organização da base de dados no </w:t>
+      </w:r>
+      <w:proofErr w:type="spellStart"/>
+      <w:r>
+        <w:rPr>
+          <w:lang w:eastAsia="pt-PT" w:bidi="pt-PT"/>
+        </w:rPr>
+        <w:t>phpMyAdmin</w:t>
+      </w:r>
+      <w:proofErr w:type="spellEnd"/>
+      <w:r>
+        <w:rPr>
+          <w:lang w:eastAsia="pt-PT" w:bidi="pt-PT"/>
+        </w:rPr>
+        <w:t xml:space="preserve"> Designer.</w:t>
       </w:r>
     </w:p>
     <w:p>
@@ -5973,7 +6951,43 @@
           <w:sz w:val="20"/>
           <w:lang w:eastAsia="pt-PT" w:bidi="pt-PT"/>
         </w:rPr>
-        <w:t>Figura T4 - phpMyAdmin Designer organizado da base de dados Greenerry.</w:t>
+        <w:t xml:space="preserve">Figura T4 - </w:t>
+      </w:r>
+      <w:proofErr w:type="spellStart"/>
+      <w:r>
+        <w:rPr>
+          <w:i/>
+          <w:sz w:val="20"/>
+          <w:lang w:eastAsia="pt-PT" w:bidi="pt-PT"/>
+        </w:rPr>
+        <w:t>phpMyAdmin</w:t>
+      </w:r>
+      <w:proofErr w:type="spellEnd"/>
+      <w:r>
+        <w:rPr>
+          <w:i/>
+          <w:sz w:val="20"/>
+          <w:lang w:eastAsia="pt-PT" w:bidi="pt-PT"/>
+        </w:rPr>
+        <w:t xml:space="preserve"> Designer organizado da base de dados </w:t>
+      </w:r>
+      <w:proofErr w:type="spellStart"/>
+      <w:r>
+        <w:rPr>
+          <w:i/>
+          <w:sz w:val="20"/>
+          <w:lang w:eastAsia="pt-PT" w:bidi="pt-PT"/>
+        </w:rPr>
+        <w:t>Greenerry</w:t>
+      </w:r>
+      <w:proofErr w:type="spellEnd"/>
+      <w:r>
+        <w:rPr>
+          <w:i/>
+          <w:sz w:val="20"/>
+          <w:lang w:eastAsia="pt-PT" w:bidi="pt-PT"/>
+        </w:rPr>
+        <w:t>.</w:t>
       </w:r>
     </w:p>
     <w:p>
@@ -6313,7 +7327,23 @@
           <w:i/>
           <w:sz w:val="20"/>
         </w:rPr>
-        <w:t>Figura T9 - Dashboard de artista com indicadores próprios.</w:t>
+        <w:t xml:space="preserve">Figura T9 - </w:t>
+      </w:r>
+      <w:proofErr w:type="spellStart"/>
+      <w:r>
+        <w:rPr>
+          <w:i/>
+          <w:sz w:val="20"/>
+        </w:rPr>
+        <w:t>Dashboard</w:t>
+      </w:r>
+      <w:proofErr w:type="spellEnd"/>
+      <w:r>
+        <w:rPr>
+          <w:i/>
+          <w:sz w:val="20"/>
+        </w:rPr>
+        <w:t xml:space="preserve"> de artista com indicadores próprios.</w:t>
       </w:r>
     </w:p>
     <w:p>
@@ -6440,7 +7470,39 @@
           <w:i/>
           <w:sz w:val="20"/>
         </w:rPr>
-        <w:t>Figura T11 - Dashboard administrativo após entrada com conta admin.</w:t>
+        <w:t xml:space="preserve">Figura T11 - </w:t>
+      </w:r>
+      <w:proofErr w:type="spellStart"/>
+      <w:r>
+        <w:rPr>
+          <w:i/>
+          <w:sz w:val="20"/>
+        </w:rPr>
+        <w:t>Dashboard</w:t>
+      </w:r>
+      <w:proofErr w:type="spellEnd"/>
+      <w:r>
+        <w:rPr>
+          <w:i/>
+          <w:sz w:val="20"/>
+        </w:rPr>
+        <w:t xml:space="preserve"> administrativo após entrada com conta </w:t>
+      </w:r>
+      <w:proofErr w:type="spellStart"/>
+      <w:r>
+        <w:rPr>
+          <w:i/>
+          <w:sz w:val="20"/>
+        </w:rPr>
+        <w:t>admin</w:t>
+      </w:r>
+      <w:proofErr w:type="spellEnd"/>
+      <w:r>
+        <w:rPr>
+          <w:i/>
+          <w:sz w:val="20"/>
+        </w:rPr>
+        <w:t>.</w:t>
       </w:r>
     </w:p>
     <w:p>
@@ -6616,7 +7678,23 @@
         <w:color w:val="666666"/>
         <w:sz w:val="18"/>
       </w:rPr>
-      <w:t xml:space="preserve">Srijan Gautam | Greenerry | Página </w:t>
+      <w:t xml:space="preserve">Srijan Gautam | </w:t>
+    </w:r>
+    <w:proofErr w:type="spellStart"/>
+    <w:r>
+      <w:rPr>
+        <w:color w:val="666666"/>
+        <w:sz w:val="18"/>
+      </w:rPr>
+      <w:t>Greenerry</w:t>
+    </w:r>
+    <w:proofErr w:type="spellEnd"/>
+    <w:r>
+      <w:rPr>
+        <w:color w:val="666666"/>
+        <w:sz w:val="18"/>
+      </w:rPr>
+      <w:t xml:space="preserve"> | Página </w:t>
     </w:r>
     <w:r>
       <w:fldChar w:fldCharType="begin"/>
@@ -6678,7 +7756,23 @@
         <w:color w:val="666666"/>
         <w:sz w:val="18"/>
       </w:rPr>
-      <w:t xml:space="preserve">Srijan Gautam | Greenerry | Página </w:t>
+      <w:t xml:space="preserve">Srijan Gautam | </w:t>
+    </w:r>
+    <w:proofErr w:type="spellStart"/>
+    <w:r>
+      <w:rPr>
+        <w:color w:val="666666"/>
+        <w:sz w:val="18"/>
+      </w:rPr>
+      <w:t>Greenerry</w:t>
+    </w:r>
+    <w:proofErr w:type="spellEnd"/>
+    <w:r>
+      <w:rPr>
+        <w:color w:val="666666"/>
+        <w:sz w:val="18"/>
+      </w:rPr>
+      <w:t xml:space="preserve"> | Página </w:t>
     </w:r>
     <w:r>
       <w:fldChar w:fldCharType="begin"/>
@@ -6740,7 +7834,23 @@
         <w:color w:val="666666"/>
         <w:sz w:val="18"/>
       </w:rPr>
-      <w:t xml:space="preserve">Srijan Gautam | Greenerry | Página </w:t>
+      <w:t xml:space="preserve">Srijan Gautam | </w:t>
+    </w:r>
+    <w:proofErr w:type="spellStart"/>
+    <w:r>
+      <w:rPr>
+        <w:color w:val="666666"/>
+        <w:sz w:val="18"/>
+      </w:rPr>
+      <w:t>Greenerry</w:t>
+    </w:r>
+    <w:proofErr w:type="spellEnd"/>
+    <w:r>
+      <w:rPr>
+        <w:color w:val="666666"/>
+        <w:sz w:val="18"/>
+      </w:rPr>
+      <w:t xml:space="preserve"> | Página </w:t>
     </w:r>
     <w:r>
       <w:fldChar w:fldCharType="begin"/>
@@ -6802,7 +7912,23 @@
         <w:color w:val="666666"/>
         <w:sz w:val="18"/>
       </w:rPr>
-      <w:t xml:space="preserve">Srijan Gautam | Greenerry | Página </w:t>
+      <w:t xml:space="preserve">Srijan Gautam | </w:t>
+    </w:r>
+    <w:proofErr w:type="spellStart"/>
+    <w:r>
+      <w:rPr>
+        <w:color w:val="666666"/>
+        <w:sz w:val="18"/>
+      </w:rPr>
+      <w:t>Greenerry</w:t>
+    </w:r>
+    <w:proofErr w:type="spellEnd"/>
+    <w:r>
+      <w:rPr>
+        <w:color w:val="666666"/>
+        <w:sz w:val="18"/>
+      </w:rPr>
+      <w:t xml:space="preserve"> | Página </w:t>
     </w:r>
     <w:r>
       <w:fldChar w:fldCharType="begin"/>
@@ -6884,12 +8010,21 @@
     <w:pPr>
       <w:jc w:val="center"/>
     </w:pPr>
+    <w:proofErr w:type="spellStart"/>
     <w:r>
       <w:rPr>
         <w:b/>
         <w:sz w:val="20"/>
       </w:rPr>
-      <w:t>Greenerry - Manual Técnico</w:t>
+      <w:t>Greenerry</w:t>
+    </w:r>
+    <w:proofErr w:type="spellEnd"/>
+    <w:r>
+      <w:rPr>
+        <w:b/>
+        <w:sz w:val="20"/>
+      </w:rPr>
+      <w:t xml:space="preserve"> - Manual Técnico</w:t>
     </w:r>
   </w:p>
   <w:p>
@@ -6913,12 +8048,21 @@
     <w:pPr>
       <w:jc w:val="center"/>
     </w:pPr>
+    <w:proofErr w:type="spellStart"/>
     <w:r>
       <w:rPr>
         <w:b/>
         <w:sz w:val="20"/>
       </w:rPr>
-      <w:t>Greenerry - Manual Técnico</w:t>
+      <w:t>Greenerry</w:t>
+    </w:r>
+    <w:proofErr w:type="spellEnd"/>
+    <w:r>
+      <w:rPr>
+        <w:b/>
+        <w:sz w:val="20"/>
+      </w:rPr>
+      <w:t xml:space="preserve"> - Manual Técnico</w:t>
     </w:r>
   </w:p>
   <w:p>
@@ -6942,12 +8086,21 @@
     <w:pPr>
       <w:jc w:val="center"/>
     </w:pPr>
+    <w:proofErr w:type="spellStart"/>
     <w:r>
       <w:rPr>
         <w:b/>
         <w:sz w:val="20"/>
       </w:rPr>
-      <w:t>Greenerry - Manual Técnico</w:t>
+      <w:t>Greenerry</w:t>
+    </w:r>
+    <w:proofErr w:type="spellEnd"/>
+    <w:r>
+      <w:rPr>
+        <w:b/>
+        <w:sz w:val="20"/>
+      </w:rPr>
+      <w:t xml:space="preserve"> - Manual Técnico</w:t>
     </w:r>
   </w:p>
   <w:p>

</xml_diff>

<commit_message>
Polish final PAP report and platform flows
</commit_message>
<xml_diff>
--- a/docs/PAP_ENTREGA/Manual_Tecnico_Greenerry_Srijan_Gautam.docx
+++ b/docs/PAP_ENTREGA/Manual_Tecnico_Greenerry_Srijan_Gautam.docx
@@ -162,8 +162,9 @@
     </w:p>
     <w:p>
       <w:pPr>
+        <w:keepLines/>
         <w:ind w:firstLine="709"/>
-        <w:jc w:val="both"/>
+        <w:jc w:val="center"/>
         <w:rPr>
           <w:lang w:eastAsia="pt-PT" w:bidi="pt-PT"/>
         </w:rPr>
@@ -177,8 +178,9 @@
     </w:p>
     <w:p>
       <w:pPr>
+        <w:keepLines/>
         <w:ind w:firstLine="709"/>
-        <w:jc w:val="both"/>
+        <w:jc w:val="center"/>
       </w:pPr>
       <w:r>
         <w:rPr>

</xml_diff>

<commit_message>
Clean PAP delivery and expand technical manual
</commit_message>
<xml_diff>
--- a/docs/PAP_ENTREGA/Manual_Tecnico_Greenerry_Srijan_Gautam.docx
+++ b/docs/PAP_ENTREGA/Manual_Tecnico_Greenerry_Srijan_Gautam.docx
@@ -164,7 +164,7 @@
       <w:pPr>
         <w:keepLines/>
         <w:ind w:firstLine="709"/>
-        <w:jc w:val="center"/>
+        <w:jc w:val="both"/>
         <w:rPr>
           <w:lang w:eastAsia="pt-PT" w:bidi="pt-PT"/>
         </w:rPr>
@@ -180,7 +180,10 @@
       <w:pPr>
         <w:keepLines/>
         <w:ind w:firstLine="709"/>
-        <w:jc w:val="center"/>
+        <w:jc w:val="both"/>
+        <w:rPr>
+          <w:lang w:eastAsia="pt-PT" w:bidi="pt-PT"/>
+        </w:rPr>
       </w:pPr>
       <w:r>
         <w:rPr>
@@ -1565,6 +1568,16 @@
           <w:fldChar w:fldCharType="end"/>
         </w:r>
       </w:hyperlink>
+    </w:p>
+    <w:p>
+      <w:pPr>
+        <w:pStyle w:val="TOC1"/>
+      </w:pPr>
+      <w:r>
+        <w:t>14. Referência técnica dos ficheiros</w:t>
+        <w:tab/>
+        <w:t>13</w:t>
+      </w:r>
     </w:p>
     <w:p>
       <w:pPr>
@@ -2216,6 +2229,63 @@
         <w:t>3. Estrutura do projeto</w:t>
       </w:r>
       <w:bookmarkEnd w:id="3"/>
+    </w:p>
+    <w:p>
+      <w:pPr/>
+      <w:r>
+        <w:t>A estrutura foi reduzida aos diretórios necessários para executar, compreender e entregar a aplicação. A imagem corresponde à organização final apresentada no Explorador do projeto.</w:t>
+      </w:r>
+    </w:p>
+    <w:p>
+      <w:pPr>
+        <w:jc w:val="center"/>
+      </w:pPr>
+      <w:r>
+        <w:drawing>
+          <wp:inline xmlns:a="http://schemas.openxmlformats.org/drawingml/2006/main" xmlns:pic="http://schemas.openxmlformats.org/drawingml/2006/picture">
+            <wp:extent cx="5715000" cy="4000500"/>
+            <wp:docPr id="17" name="Picture 17"/>
+            <wp:cNvGraphicFramePr>
+              <a:graphicFrameLocks noChangeAspect="1"/>
+            </wp:cNvGraphicFramePr>
+            <a:graphic>
+              <a:graphicData uri="http://schemas.openxmlformats.org/drawingml/2006/picture">
+                <pic:pic>
+                  <pic:nvPicPr>
+                    <pic:cNvPr id="0" name="greenerry_project_tree.png"/>
+                    <pic:cNvPicPr/>
+                  </pic:nvPicPr>
+                  <pic:blipFill>
+                    <a:blip r:embed="rId31"/>
+                    <a:stretch>
+                      <a:fillRect/>
+                    </a:stretch>
+                  </pic:blipFill>
+                  <pic:spPr>
+                    <a:xfrm>
+                      <a:off x="0" y="0"/>
+                      <a:ext cx="5715000" cy="4000500"/>
+                    </a:xfrm>
+                    <a:prstGeom prst="rect"/>
+                  </pic:spPr>
+                </pic:pic>
+              </a:graphicData>
+            </a:graphic>
+          </wp:inline>
+        </w:drawing>
+      </w:r>
+    </w:p>
+    <w:p>
+      <w:pPr>
+        <w:jc w:val="center"/>
+      </w:pPr>
+      <w:r>
+        <w:rPr>
+          <w:i/>
+          <w:sz w:val="17"/>
+        </w:rPr>
+        <w:t>Figura E1 - Estrutura final do projeto Greenerry.</w:t>
+      </w:r>
     </w:p>
     <w:tbl>
       <w:tblPr>
@@ -7631,6 +7701,1679 @@
           <w:sz w:val="20"/>
         </w:rPr>
         <w:t>Figura T13 - Revisão e gestão administrativa de produtos.</w:t>
+      </w:r>
+    </w:p>
+    <w:p>
+      <w:pPr>
+        <w:pStyle w:val="TOC2"/>
+        <w:tabs>
+          <w:tab w:val="right" w:leader="dot" w:pos="8211"/>
+        </w:tabs>
+        <w:rPr>
+          <w:rFonts w:asciiTheme="minorHAnsi" w:eastAsiaTheme="minorEastAsia" w:hAnsiTheme="minorHAnsi" w:cstheme="minorBidi"/>
+          <w:noProof/>
+          <w:kern w:val="2"/>
+          <w:sz w:val="24"/>
+          <w:szCs w:val="24"/>
+          <w:lang w:val="en-US"/>
+          <w14:ligatures w14:val="standardContextual"/>
+        </w:rPr>
+      </w:pPr>
+      <w:hyperlink w:anchor="_Toc232637517" w:history="1">
+        <w:r>
+          <w:rPr>
+            <w:rStyle w:val="Hyperlink"/>
+            <w:noProof/>
+          </w:rPr>
+          <w:t>13.1 Sequência visual para instalação, validação e demonstração</w:t>
+        </w:r>
+        <w:r>
+          <w:rPr>
+            <w:noProof/>
+            <w:webHidden/>
+          </w:rPr>
+          <w:tab/>
+        </w:r>
+        <w:r>
+          <w:rPr>
+            <w:noProof/>
+            <w:webHidden/>
+          </w:rPr>
+          <w:fldChar w:fldCharType="begin"/>
+        </w:r>
+        <w:r>
+          <w:rPr>
+            <w:noProof/>
+            <w:webHidden/>
+          </w:rPr>
+          <w:instrText xml:space="preserve"> PAGEREF _Toc232637517 \h </w:instrText>
+        </w:r>
+        <w:r>
+          <w:rPr>
+            <w:noProof/>
+            <w:webHidden/>
+          </w:rPr>
+        </w:r>
+        <w:r>
+          <w:rPr>
+            <w:noProof/>
+            <w:webHidden/>
+          </w:rPr>
+          <w:fldChar w:fldCharType="separate"/>
+        </w:r>
+        <w:r>
+          <w:rPr>
+            <w:noProof/>
+            <w:webHidden/>
+          </w:rPr>
+          <w:t>10</w:t>
+        </w:r>
+        <w:r>
+          <w:rPr>
+            <w:noProof/>
+            <w:webHidden/>
+          </w:rPr>
+          <w:fldChar w:fldCharType="end"/>
+        </w:r>
+      </w:hyperlink>
+    </w:p>
+    <w:p>
+      <w:pPr>
+        <w:pStyle w:val="Heading1"/>
+      </w:pPr>
+      <w:r>
+        <w:t>14. Referência técnica dos ficheiros</w:t>
+      </w:r>
+    </w:p>
+    <w:p>
+      <w:r>
+        <w:t>Esta referência identifica o objetivo de cada página e dos principais ficheiros de backend. Os nomes correspondem à estrutura real do projeto.</w:t>
+      </w:r>
+    </w:p>
+    <w:p>
+      <w:pPr>
+        <w:pStyle w:val="Heading2"/>
+      </w:pPr>
+      <w:r>
+        <w:t>14.1 Páginas públicas, cliente e artista</w:t>
+      </w:r>
+    </w:p>
+    <w:p>
+      <w:pPr>
+        <w:keepLines/>
+        <w:spacing w:after="60"/>
+        <w:ind w:left="173"/>
+      </w:pPr>
+      <w:r>
+        <w:rPr>
+          <w:rFonts w:ascii="Consolas" w:hAnsi="Consolas"/>
+          <w:b/>
+          <w:sz w:val="17"/>
+        </w:rPr>
+        <w:t xml:space="preserve">index.php - </w:t>
+      </w:r>
+      <w:r>
+        <w:rPr>
+          <w:sz w:val="18"/>
+        </w:rPr>
+        <w:t>Encaminha o acesso da raiz para a página inicial da Greenerry.</w:t>
+      </w:r>
+    </w:p>
+    <w:p>
+      <w:pPr>
+        <w:keepLines/>
+        <w:spacing w:after="60"/>
+        <w:ind w:left="173"/>
+      </w:pPr>
+      <w:r>
+        <w:rPr>
+          <w:rFonts w:ascii="Consolas" w:hAnsi="Consolas"/>
+          <w:b/>
+          <w:sz w:val="17"/>
+        </w:rPr>
+        <w:t xml:space="preserve">pages/index.php - </w:t>
+      </w:r>
+      <w:r>
+        <w:rPr>
+          <w:sz w:val="18"/>
+        </w:rPr>
+        <w:t>Apresenta a página inicial com música, artistas e produtos em destaque.</w:t>
+      </w:r>
+    </w:p>
+    <w:p>
+      <w:pPr>
+        <w:keepLines/>
+        <w:spacing w:after="60"/>
+        <w:ind w:left="173"/>
+      </w:pPr>
+      <w:r>
+        <w:rPr>
+          <w:rFonts w:ascii="Consolas" w:hAnsi="Consolas"/>
+          <w:b/>
+          <w:sz w:val="17"/>
+        </w:rPr>
+        <w:t xml:space="preserve">pages/music.php - </w:t>
+      </w:r>
+      <w:r>
+        <w:rPr>
+          <w:sz w:val="18"/>
+        </w:rPr>
+        <w:t>Apresenta o catálogo musical, pesquisa, filtros, paginação e dados usados pelo leitor.</w:t>
+      </w:r>
+    </w:p>
+    <w:p>
+      <w:pPr>
+        <w:keepLines/>
+        <w:spacing w:after="60"/>
+        <w:ind w:left="173"/>
+      </w:pPr>
+      <w:r>
+        <w:rPr>
+          <w:rFonts w:ascii="Consolas" w:hAnsi="Consolas"/>
+          <w:b/>
+          <w:sz w:val="17"/>
+        </w:rPr>
+        <w:t xml:space="preserve">pages/artists.php - </w:t>
+      </w:r>
+      <w:r>
+        <w:rPr>
+          <w:sz w:val="18"/>
+        </w:rPr>
+        <w:t>Lista os artistas públicos com pesquisa e paginação.</w:t>
+      </w:r>
+    </w:p>
+    <w:p>
+      <w:pPr>
+        <w:keepLines/>
+        <w:spacing w:after="60"/>
+        <w:ind w:left="173"/>
+      </w:pPr>
+      <w:r>
+        <w:rPr>
+          <w:rFonts w:ascii="Consolas" w:hAnsi="Consolas"/>
+          <w:b/>
+          <w:sz w:val="17"/>
+        </w:rPr>
+        <w:t xml:space="preserve">pages/artist.php - </w:t>
+      </w:r>
+      <w:r>
+        <w:rPr>
+          <w:sz w:val="18"/>
+        </w:rPr>
+        <w:t>Mostra o perfil público de um artista, lançamentos e merchandising.</w:t>
+      </w:r>
+    </w:p>
+    <w:p>
+      <w:pPr>
+        <w:keepLines/>
+        <w:spacing w:after="60"/>
+        <w:ind w:left="173"/>
+      </w:pPr>
+      <w:r>
+        <w:rPr>
+          <w:rFonts w:ascii="Consolas" w:hAnsi="Consolas"/>
+          <w:b/>
+          <w:sz w:val="17"/>
+        </w:rPr>
+        <w:t xml:space="preserve">pages/release.php - </w:t>
+      </w:r>
+      <w:r>
+        <w:rPr>
+          <w:sz w:val="18"/>
+        </w:rPr>
+        <w:t>Mostra um lançamento musical e as respetivas faixas.</w:t>
+      </w:r>
+    </w:p>
+    <w:p>
+      <w:pPr>
+        <w:keepLines/>
+        <w:spacing w:after="60"/>
+        <w:ind w:left="173"/>
+      </w:pPr>
+      <w:r>
+        <w:rPr>
+          <w:rFonts w:ascii="Consolas" w:hAnsi="Consolas"/>
+          <w:b/>
+          <w:sz w:val="17"/>
+        </w:rPr>
+        <w:t xml:space="preserve">pages/shop.php - </w:t>
+      </w:r>
+      <w:r>
+        <w:rPr>
+          <w:sz w:val="18"/>
+        </w:rPr>
+        <w:t>Apresenta a loja, categorias, filtros, pesquisa e paginação de produtos.</w:t>
+      </w:r>
+    </w:p>
+    <w:p>
+      <w:pPr>
+        <w:keepLines/>
+        <w:spacing w:after="60"/>
+        <w:ind w:left="173"/>
+      </w:pPr>
+      <w:r>
+        <w:rPr>
+          <w:rFonts w:ascii="Consolas" w:hAnsi="Consolas"/>
+          <w:b/>
+          <w:sz w:val="17"/>
+        </w:rPr>
+        <w:t xml:space="preserve">pages/produto.php - </w:t>
+      </w:r>
+      <w:r>
+        <w:rPr>
+          <w:sz w:val="18"/>
+        </w:rPr>
+        <w:t>Mostra o detalhe do produto, descrição, imagens, tamanho, stock e compra.</w:t>
+      </w:r>
+    </w:p>
+    <w:p>
+      <w:pPr>
+        <w:keepLines/>
+        <w:spacing w:after="60"/>
+        <w:ind w:left="173"/>
+      </w:pPr>
+      <w:r>
+        <w:rPr>
+          <w:rFonts w:ascii="Consolas" w:hAnsi="Consolas"/>
+          <w:b/>
+          <w:sz w:val="17"/>
+        </w:rPr>
+        <w:t xml:space="preserve">pages/login.php - </w:t>
+      </w:r>
+      <w:r>
+        <w:rPr>
+          <w:sz w:val="18"/>
+        </w:rPr>
+        <w:t>Valida as credenciais e inicia a sessão do cliente.</w:t>
+      </w:r>
+    </w:p>
+    <w:p>
+      <w:pPr>
+        <w:keepLines/>
+        <w:spacing w:after="60"/>
+        <w:ind w:left="173"/>
+      </w:pPr>
+      <w:r>
+        <w:rPr>
+          <w:rFonts w:ascii="Consolas" w:hAnsi="Consolas"/>
+          <w:b/>
+          <w:sz w:val="17"/>
+        </w:rPr>
+        <w:t xml:space="preserve">pages/logout.php - </w:t>
+      </w:r>
+      <w:r>
+        <w:rPr>
+          <w:sz w:val="18"/>
+        </w:rPr>
+        <w:t>Termina a sessão atual de forma segura.</w:t>
+      </w:r>
+    </w:p>
+    <w:p>
+      <w:pPr>
+        <w:keepLines/>
+        <w:spacing w:after="60"/>
+        <w:ind w:left="173"/>
+      </w:pPr>
+      <w:r>
+        <w:rPr>
+          <w:rFonts w:ascii="Consolas" w:hAnsi="Consolas"/>
+          <w:b/>
+          <w:sz w:val="17"/>
+        </w:rPr>
+        <w:t xml:space="preserve">pages/registar.php - </w:t>
+      </w:r>
+      <w:r>
+        <w:rPr>
+          <w:sz w:val="18"/>
+        </w:rPr>
+        <w:t>Valida o registo, cria a conta e inicia a verificação por e-mail.</w:t>
+      </w:r>
+    </w:p>
+    <w:p>
+      <w:pPr>
+        <w:keepLines/>
+        <w:spacing w:after="60"/>
+        <w:ind w:left="173"/>
+      </w:pPr>
+      <w:r>
+        <w:rPr>
+          <w:rFonts w:ascii="Consolas" w:hAnsi="Consolas"/>
+          <w:b/>
+          <w:sz w:val="17"/>
+        </w:rPr>
+        <w:t xml:space="preserve">pages/verify_email.php - </w:t>
+      </w:r>
+      <w:r>
+        <w:rPr>
+          <w:sz w:val="18"/>
+        </w:rPr>
+        <w:t>Confirma o código enviado e ativa a nova conta.</w:t>
+      </w:r>
+    </w:p>
+    <w:p>
+      <w:pPr>
+        <w:keepLines/>
+        <w:spacing w:after="60"/>
+        <w:ind w:left="173"/>
+      </w:pPr>
+      <w:r>
+        <w:rPr>
+          <w:rFonts w:ascii="Consolas" w:hAnsi="Consolas"/>
+          <w:b/>
+          <w:sz w:val="17"/>
+        </w:rPr>
+        <w:t xml:space="preserve">pages/forgot_password.php - </w:t>
+      </w:r>
+      <w:r>
+        <w:rPr>
+          <w:sz w:val="18"/>
+        </w:rPr>
+        <w:t>Inicia a recuperação da palavra-passe por código enviado por e-mail.</w:t>
+      </w:r>
+    </w:p>
+    <w:p>
+      <w:pPr>
+        <w:keepLines/>
+        <w:spacing w:after="60"/>
+        <w:ind w:left="173"/>
+      </w:pPr>
+      <w:r>
+        <w:rPr>
+          <w:rFonts w:ascii="Consolas" w:hAnsi="Consolas"/>
+          <w:b/>
+          <w:sz w:val="17"/>
+        </w:rPr>
+        <w:t xml:space="preserve">pages/reset_password.php - </w:t>
+      </w:r>
+      <w:r>
+        <w:rPr>
+          <w:sz w:val="18"/>
+        </w:rPr>
+        <w:t>Valida o código e permite definir uma nova palavra-passe.</w:t>
+      </w:r>
+    </w:p>
+    <w:p>
+      <w:pPr>
+        <w:keepLines/>
+        <w:spacing w:after="60"/>
+        <w:ind w:left="173"/>
+      </w:pPr>
+      <w:r>
+        <w:rPr>
+          <w:rFonts w:ascii="Consolas" w:hAnsi="Consolas"/>
+          <w:b/>
+          <w:sz w:val="17"/>
+        </w:rPr>
+        <w:t xml:space="preserve">pages/profile.php - </w:t>
+      </w:r>
+      <w:r>
+        <w:rPr>
+          <w:sz w:val="18"/>
+        </w:rPr>
+        <w:t>Apresenta e atualiza o perfil, moradas e conteúdos próprios do utilizador.</w:t>
+      </w:r>
+    </w:p>
+    <w:p>
+      <w:pPr>
+        <w:keepLines/>
+        <w:spacing w:after="60"/>
+        <w:ind w:left="173"/>
+      </w:pPr>
+      <w:r>
+        <w:rPr>
+          <w:rFonts w:ascii="Consolas" w:hAnsi="Consolas"/>
+          <w:b/>
+          <w:sz w:val="17"/>
+        </w:rPr>
+        <w:t xml:space="preserve">pages/cart.php - </w:t>
+      </w:r>
+      <w:r>
+        <w:rPr>
+          <w:sz w:val="18"/>
+        </w:rPr>
+        <w:t>Apresenta o carrinho e permite alterar quantidades ou remover produtos.</w:t>
+      </w:r>
+    </w:p>
+    <w:p>
+      <w:pPr>
+        <w:keepLines/>
+        <w:spacing w:after="60"/>
+        <w:ind w:left="173"/>
+      </w:pPr>
+      <w:r>
+        <w:rPr>
+          <w:rFonts w:ascii="Consolas" w:hAnsi="Consolas"/>
+          <w:b/>
+          <w:sz w:val="17"/>
+        </w:rPr>
+        <w:t xml:space="preserve">pages/checkout.php - </w:t>
+      </w:r>
+      <w:r>
+        <w:rPr>
+          <w:sz w:val="18"/>
+        </w:rPr>
+        <w:t>Valida a entrega e cria a encomenda e o pagamento demonstrativo.</w:t>
+      </w:r>
+    </w:p>
+    <w:p>
+      <w:pPr>
+        <w:keepLines/>
+        <w:spacing w:after="60"/>
+        <w:ind w:left="173"/>
+      </w:pPr>
+      <w:r>
+        <w:rPr>
+          <w:rFonts w:ascii="Consolas" w:hAnsi="Consolas"/>
+          <w:b/>
+          <w:sz w:val="17"/>
+        </w:rPr>
+        <w:t xml:space="preserve">pages/receipt.php - </w:t>
+      </w:r>
+      <w:r>
+        <w:rPr>
+          <w:sz w:val="18"/>
+        </w:rPr>
+        <w:t>Gera a fatura ou recibo em PDF para uma encomenda autorizada.</w:t>
+      </w:r>
+    </w:p>
+    <w:p>
+      <w:pPr>
+        <w:keepLines/>
+        <w:spacing w:after="60"/>
+        <w:ind w:left="173"/>
+      </w:pPr>
+      <w:r>
+        <w:rPr>
+          <w:rFonts w:ascii="Consolas" w:hAnsi="Consolas"/>
+          <w:b/>
+          <w:sz w:val="17"/>
+        </w:rPr>
+        <w:t xml:space="preserve">pages/my_orders.php - </w:t>
+      </w:r>
+      <w:r>
+        <w:rPr>
+          <w:sz w:val="18"/>
+        </w:rPr>
+        <w:t>Lista as compras do cliente e mostra o detalhe de cada encomenda.</w:t>
+      </w:r>
+    </w:p>
+    <w:p>
+      <w:pPr>
+        <w:keepLines/>
+        <w:spacing w:after="60"/>
+        <w:ind w:left="173"/>
+      </w:pPr>
+      <w:r>
+        <w:rPr>
+          <w:rFonts w:ascii="Consolas" w:hAnsi="Consolas"/>
+          <w:b/>
+          <w:sz w:val="17"/>
+        </w:rPr>
+        <w:t xml:space="preserve">pages/favourites.php - </w:t>
+      </w:r>
+      <w:r>
+        <w:rPr>
+          <w:sz w:val="18"/>
+        </w:rPr>
+        <w:t>Reúne playlists, músicas favoritas e artistas seguidos na biblioteca.</w:t>
+      </w:r>
+    </w:p>
+    <w:p>
+      <w:pPr>
+        <w:keepLines/>
+        <w:spacing w:after="60"/>
+        <w:ind w:left="173"/>
+      </w:pPr>
+      <w:r>
+        <w:rPr>
+          <w:rFonts w:ascii="Consolas" w:hAnsi="Consolas"/>
+          <w:b/>
+          <w:sz w:val="17"/>
+        </w:rPr>
+        <w:t xml:space="preserve">pages/notifications.php - </w:t>
+      </w:r>
+      <w:r>
+        <w:rPr>
+          <w:sz w:val="18"/>
+        </w:rPr>
+        <w:t>Lista notificações, pagina resultados e gere o estado lido/não lido.</w:t>
+      </w:r>
+    </w:p>
+    <w:p>
+      <w:pPr>
+        <w:keepLines/>
+        <w:spacing w:after="60"/>
+        <w:ind w:left="173"/>
+      </w:pPr>
+      <w:r>
+        <w:rPr>
+          <w:rFonts w:ascii="Consolas" w:hAnsi="Consolas"/>
+          <w:b/>
+          <w:sz w:val="17"/>
+        </w:rPr>
+        <w:t xml:space="preserve">pages/contact_admin.php - </w:t>
+      </w:r>
+      <w:r>
+        <w:rPr>
+          <w:sz w:val="18"/>
+        </w:rPr>
+        <w:t>Permite enviar pedidos de apoio e consultar respostas com paginação.</w:t>
+      </w:r>
+    </w:p>
+    <w:p>
+      <w:pPr>
+        <w:keepLines/>
+        <w:spacing w:after="60"/>
+        <w:ind w:left="173"/>
+      </w:pPr>
+      <w:r>
+        <w:rPr>
+          <w:rFonts w:ascii="Consolas" w:hAnsi="Consolas"/>
+          <w:b/>
+          <w:sz w:val="17"/>
+        </w:rPr>
+        <w:t xml:space="preserve">pages/artist_dashboard.php - </w:t>
+      </w:r>
+      <w:r>
+        <w:rPr>
+          <w:sz w:val="18"/>
+        </w:rPr>
+        <w:t>Resume vendas, música, mensagens e indicadores da área de artista.</w:t>
+      </w:r>
+    </w:p>
+    <w:p>
+      <w:pPr>
+        <w:keepLines/>
+        <w:spacing w:after="60"/>
+        <w:ind w:left="173"/>
+      </w:pPr>
+      <w:r>
+        <w:rPr>
+          <w:rFonts w:ascii="Consolas" w:hAnsi="Consolas"/>
+          <w:b/>
+          <w:sz w:val="17"/>
+        </w:rPr>
+        <w:t xml:space="preserve">pages/artist_analytics.php - </w:t>
+      </w:r>
+      <w:r>
+        <w:rPr>
+          <w:sz w:val="18"/>
+        </w:rPr>
+        <w:t>Apresenta audições, ouvintes e desempenho das faixas por período.</w:t>
+      </w:r>
+    </w:p>
+    <w:p>
+      <w:pPr>
+        <w:keepLines/>
+        <w:spacing w:after="60"/>
+        <w:ind w:left="173"/>
+      </w:pPr>
+      <w:r>
+        <w:rPr>
+          <w:rFonts w:ascii="Consolas" w:hAnsi="Consolas"/>
+          <w:b/>
+          <w:sz w:val="17"/>
+        </w:rPr>
+        <w:t xml:space="preserve">pages/artist_messages.php - </w:t>
+      </w:r>
+      <w:r>
+        <w:rPr>
+          <w:sz w:val="18"/>
+        </w:rPr>
+        <w:t>Filtra conversas e permite responder aos compradores.</w:t>
+      </w:r>
+    </w:p>
+    <w:p>
+      <w:pPr>
+        <w:keepLines/>
+        <w:spacing w:after="60"/>
+        <w:ind w:left="173"/>
+      </w:pPr>
+      <w:r>
+        <w:rPr>
+          <w:rFonts w:ascii="Consolas" w:hAnsi="Consolas"/>
+          <w:b/>
+          <w:sz w:val="17"/>
+        </w:rPr>
+        <w:t xml:space="preserve">pages/artist_releases.php - </w:t>
+      </w:r>
+      <w:r>
+        <w:rPr>
+          <w:sz w:val="18"/>
+        </w:rPr>
+        <w:t>Lista e gere os lançamentos submetidos pelo artista.</w:t>
+      </w:r>
+    </w:p>
+    <w:p>
+      <w:pPr>
+        <w:keepLines/>
+        <w:spacing w:after="60"/>
+        <w:ind w:left="173"/>
+      </w:pPr>
+      <w:r>
+        <w:rPr>
+          <w:rFonts w:ascii="Consolas" w:hAnsi="Consolas"/>
+          <w:b/>
+          <w:sz w:val="17"/>
+        </w:rPr>
+        <w:t xml:space="preserve">pages/artist_products.php - </w:t>
+      </w:r>
+      <w:r>
+        <w:rPr>
+          <w:sz w:val="18"/>
+        </w:rPr>
+        <w:t>Lista, pagina, edita, ativa ou desativa produtos do artista.</w:t>
+      </w:r>
+    </w:p>
+    <w:p>
+      <w:pPr>
+        <w:keepLines/>
+        <w:spacing w:after="60"/>
+        <w:ind w:left="173"/>
+      </w:pPr>
+      <w:r>
+        <w:rPr>
+          <w:rFonts w:ascii="Consolas" w:hAnsi="Consolas"/>
+          <w:b/>
+          <w:sz w:val="17"/>
+        </w:rPr>
+        <w:t xml:space="preserve">pages/artist_customers.php - </w:t>
+      </w:r>
+      <w:r>
+        <w:rPr>
+          <w:sz w:val="18"/>
+        </w:rPr>
+        <w:t>Apresenta clientes ligados às vendas do artista, com paginação.</w:t>
+      </w:r>
+    </w:p>
+    <w:p>
+      <w:pPr>
+        <w:keepLines/>
+        <w:spacing w:after="60"/>
+        <w:ind w:left="173"/>
+      </w:pPr>
+      <w:r>
+        <w:rPr>
+          <w:rFonts w:ascii="Consolas" w:hAnsi="Consolas"/>
+          <w:b/>
+          <w:sz w:val="17"/>
+        </w:rPr>
+        <w:t xml:space="preserve">pages/orders.php - </w:t>
+      </w:r>
+      <w:r>
+        <w:rPr>
+          <w:sz w:val="18"/>
+        </w:rPr>
+        <w:t>Permite ao artista acompanhar pedidos, mensagens e estados de envio.</w:t>
+      </w:r>
+    </w:p>
+    <w:p>
+      <w:pPr>
+        <w:keepLines/>
+        <w:spacing w:after="60"/>
+        <w:ind w:left="173"/>
+      </w:pPr>
+      <w:r>
+        <w:rPr>
+          <w:rFonts w:ascii="Consolas" w:hAnsi="Consolas"/>
+          <w:b/>
+          <w:sz w:val="17"/>
+        </w:rPr>
+        <w:t xml:space="preserve">pages/revenue.php - </w:t>
+      </w:r>
+      <w:r>
+        <w:rPr>
+          <w:sz w:val="18"/>
+        </w:rPr>
+        <w:t>Calcula rendimento, movimentos e exportação de dados para Excel.</w:t>
+      </w:r>
+    </w:p>
+    <w:p>
+      <w:pPr>
+        <w:keepLines/>
+        <w:spacing w:after="60"/>
+        <w:ind w:left="173"/>
+      </w:pPr>
+      <w:r>
+        <w:rPr>
+          <w:rFonts w:ascii="Consolas" w:hAnsi="Consolas"/>
+          <w:b/>
+          <w:sz w:val="17"/>
+        </w:rPr>
+        <w:t xml:space="preserve">pages/upload_music.php - </w:t>
+      </w:r>
+      <w:r>
+        <w:rPr>
+          <w:sz w:val="18"/>
+        </w:rPr>
+        <w:t>Valida e submete música, capa, ficheiro áudio e dados do lançamento.</w:t>
+      </w:r>
+    </w:p>
+    <w:p>
+      <w:pPr>
+        <w:keepLines/>
+        <w:spacing w:after="60"/>
+        <w:ind w:left="173"/>
+      </w:pPr>
+      <w:r>
+        <w:rPr>
+          <w:rFonts w:ascii="Consolas" w:hAnsi="Consolas"/>
+          <w:b/>
+          <w:sz w:val="17"/>
+        </w:rPr>
+        <w:t xml:space="preserve">pages/upload_merch.php - </w:t>
+      </w:r>
+      <w:r>
+        <w:rPr>
+          <w:sz w:val="18"/>
+        </w:rPr>
+        <w:t>Valida e cria ou atualiza produtos, imagens, tamanhos, preço e stock.</w:t>
+      </w:r>
+    </w:p>
+    <w:p>
+      <w:pPr>
+        <w:pStyle w:val="Heading2"/>
+      </w:pPr>
+      <w:r>
+        <w:t>14.2 Administração</w:t>
+      </w:r>
+    </w:p>
+    <w:p>
+      <w:pPr>
+        <w:keepLines/>
+        <w:spacing w:after="60"/>
+        <w:ind w:left="173"/>
+      </w:pPr>
+      <w:r>
+        <w:rPr>
+          <w:rFonts w:ascii="Consolas" w:hAnsi="Consolas"/>
+          <w:b/>
+          <w:sz w:val="17"/>
+        </w:rPr>
+        <w:t xml:space="preserve">admin/login.php - </w:t>
+      </w:r>
+      <w:r>
+        <w:rPr>
+          <w:sz w:val="18"/>
+        </w:rPr>
+        <w:t>Processa o login reservado da administração.</w:t>
+      </w:r>
+    </w:p>
+    <w:p>
+      <w:pPr>
+        <w:keepLines/>
+        <w:spacing w:after="60"/>
+        <w:ind w:left="173"/>
+      </w:pPr>
+      <w:r>
+        <w:rPr>
+          <w:rFonts w:ascii="Consolas" w:hAnsi="Consolas"/>
+          <w:b/>
+          <w:sz w:val="17"/>
+        </w:rPr>
+        <w:t xml:space="preserve">admin/dashboard.php - </w:t>
+      </w:r>
+      <w:r>
+        <w:rPr>
+          <w:sz w:val="18"/>
+        </w:rPr>
+        <w:t>Apresenta indicadores gerais e atalhos de gestão.</w:t>
+      </w:r>
+    </w:p>
+    <w:p>
+      <w:pPr>
+        <w:keepLines/>
+        <w:spacing w:after="60"/>
+        <w:ind w:left="173"/>
+      </w:pPr>
+      <w:r>
+        <w:rPr>
+          <w:rFonts w:ascii="Consolas" w:hAnsi="Consolas"/>
+          <w:b/>
+          <w:sz w:val="17"/>
+        </w:rPr>
+        <w:t xml:space="preserve">admin/home_curator.php - </w:t>
+      </w:r>
+      <w:r>
+        <w:rPr>
+          <w:sz w:val="18"/>
+        </w:rPr>
+        <w:t>Seleciona os conteúdos apresentados na página inicial.</w:t>
+      </w:r>
+    </w:p>
+    <w:p>
+      <w:pPr>
+        <w:keepLines/>
+        <w:spacing w:after="60"/>
+        <w:ind w:left="173"/>
+      </w:pPr>
+      <w:r>
+        <w:rPr>
+          <w:rFonts w:ascii="Consolas" w:hAnsi="Consolas"/>
+          <w:b/>
+          <w:sz w:val="17"/>
+        </w:rPr>
+        <w:t xml:space="preserve">admin/orders.php - </w:t>
+      </w:r>
+      <w:r>
+        <w:rPr>
+          <w:sz w:val="18"/>
+        </w:rPr>
+        <w:t>Pesquisa encomendas e atualiza estados de pagamento e envio.</w:t>
+      </w:r>
+    </w:p>
+    <w:p>
+      <w:pPr>
+        <w:keepLines/>
+        <w:spacing w:after="60"/>
+        <w:ind w:left="173"/>
+      </w:pPr>
+      <w:r>
+        <w:rPr>
+          <w:rFonts w:ascii="Consolas" w:hAnsi="Consolas"/>
+          <w:b/>
+          <w:sz w:val="17"/>
+        </w:rPr>
+        <w:t xml:space="preserve">admin/products.php - </w:t>
+      </w:r>
+      <w:r>
+        <w:rPr>
+          <w:sz w:val="18"/>
+        </w:rPr>
+        <w:t>Modera, aprova, rejeita e gere produtos.</w:t>
+      </w:r>
+    </w:p>
+    <w:p>
+      <w:pPr>
+        <w:keepLines/>
+        <w:spacing w:after="60"/>
+        <w:ind w:left="173"/>
+      </w:pPr>
+      <w:r>
+        <w:rPr>
+          <w:rFonts w:ascii="Consolas" w:hAnsi="Consolas"/>
+          <w:b/>
+          <w:sz w:val="17"/>
+        </w:rPr>
+        <w:t xml:space="preserve">admin/categories.php - </w:t>
+      </w:r>
+      <w:r>
+        <w:rPr>
+          <w:sz w:val="18"/>
+        </w:rPr>
+        <w:t>Cria e gere categorias de merchandising.</w:t>
+      </w:r>
+    </w:p>
+    <w:p>
+      <w:pPr>
+        <w:keepLines/>
+        <w:spacing w:after="60"/>
+        <w:ind w:left="173"/>
+      </w:pPr>
+      <w:r>
+        <w:rPr>
+          <w:rFonts w:ascii="Consolas" w:hAnsi="Consolas"/>
+          <w:b/>
+          <w:sz w:val="17"/>
+        </w:rPr>
+        <w:t xml:space="preserve">admin/releases.php - </w:t>
+      </w:r>
+      <w:r>
+        <w:rPr>
+          <w:sz w:val="18"/>
+        </w:rPr>
+        <w:t>Modera e gere lançamentos musicais.</w:t>
+      </w:r>
+    </w:p>
+    <w:p>
+      <w:pPr>
+        <w:keepLines/>
+        <w:spacing w:after="60"/>
+        <w:ind w:left="173"/>
+      </w:pPr>
+      <w:r>
+        <w:rPr>
+          <w:rFonts w:ascii="Consolas" w:hAnsi="Consolas"/>
+          <w:b/>
+          <w:sz w:val="17"/>
+        </w:rPr>
+        <w:t xml:space="preserve">admin/music.php - </w:t>
+      </w:r>
+      <w:r>
+        <w:rPr>
+          <w:sz w:val="18"/>
+        </w:rPr>
+        <w:t>Gere faixas e estados do catálogo musical.</w:t>
+      </w:r>
+    </w:p>
+    <w:p>
+      <w:pPr>
+        <w:keepLines/>
+        <w:spacing w:after="60"/>
+        <w:ind w:left="173"/>
+      </w:pPr>
+      <w:r>
+        <w:rPr>
+          <w:rFonts w:ascii="Consolas" w:hAnsi="Consolas"/>
+          <w:b/>
+          <w:sz w:val="17"/>
+        </w:rPr>
+        <w:t xml:space="preserve">admin/genres.php - </w:t>
+      </w:r>
+      <w:r>
+        <w:rPr>
+          <w:sz w:val="18"/>
+        </w:rPr>
+        <w:t>Cria, edita e organiza géneros musicais.</w:t>
+      </w:r>
+    </w:p>
+    <w:p>
+      <w:pPr>
+        <w:keepLines/>
+        <w:spacing w:after="60"/>
+        <w:ind w:left="173"/>
+      </w:pPr>
+      <w:r>
+        <w:rPr>
+          <w:rFonts w:ascii="Consolas" w:hAnsi="Consolas"/>
+          <w:b/>
+          <w:sz w:val="17"/>
+        </w:rPr>
+        <w:t xml:space="preserve">admin/users.php - </w:t>
+      </w:r>
+      <w:r>
+        <w:rPr>
+          <w:sz w:val="18"/>
+        </w:rPr>
+        <w:t>Gere contas de clientes e artistas.</w:t>
+      </w:r>
+    </w:p>
+    <w:p>
+      <w:pPr>
+        <w:keepLines/>
+        <w:spacing w:after="60"/>
+        <w:ind w:left="173"/>
+      </w:pPr>
+      <w:r>
+        <w:rPr>
+          <w:rFonts w:ascii="Consolas" w:hAnsi="Consolas"/>
+          <w:b/>
+          <w:sz w:val="17"/>
+        </w:rPr>
+        <w:t xml:space="preserve">admin/messages.php - </w:t>
+      </w:r>
+      <w:r>
+        <w:rPr>
+          <w:sz w:val="18"/>
+        </w:rPr>
+        <w:t>Consulta e responde a mensagens de apoio.</w:t>
+      </w:r>
+    </w:p>
+    <w:p>
+      <w:pPr>
+        <w:keepLines/>
+        <w:spacing w:after="60"/>
+        <w:ind w:left="173"/>
+      </w:pPr>
+      <w:r>
+        <w:rPr>
+          <w:rFonts w:ascii="Consolas" w:hAnsi="Consolas"/>
+          <w:b/>
+          <w:sz w:val="17"/>
+        </w:rPr>
+        <w:t xml:space="preserve">admin/reports.php - </w:t>
+      </w:r>
+      <w:r>
+        <w:rPr>
+          <w:sz w:val="18"/>
+        </w:rPr>
+        <w:t>Apresenta relatórios financeiros e musicais.</w:t>
+      </w:r>
+    </w:p>
+    <w:p>
+      <w:pPr>
+        <w:keepLines/>
+        <w:spacing w:after="60"/>
+        <w:ind w:left="173"/>
+      </w:pPr>
+      <w:r>
+        <w:rPr>
+          <w:rFonts w:ascii="Consolas" w:hAnsi="Consolas"/>
+          <w:b/>
+          <w:sz w:val="17"/>
+        </w:rPr>
+        <w:t xml:space="preserve">admin/page_maintenance.php - </w:t>
+      </w:r>
+      <w:r>
+        <w:rPr>
+          <w:sz w:val="18"/>
+        </w:rPr>
+        <w:t>Ativa ou suspende páginas públicas em manutenção.</w:t>
+      </w:r>
+    </w:p>
+    <w:p>
+      <w:pPr>
+        <w:keepLines/>
+        <w:spacing w:after="60"/>
+        <w:ind w:left="173"/>
+      </w:pPr>
+      <w:r>
+        <w:rPr>
+          <w:rFonts w:ascii="Consolas" w:hAnsi="Consolas"/>
+          <w:b/>
+          <w:sz w:val="17"/>
+        </w:rPr>
+        <w:t xml:space="preserve">admin/admins.php - </w:t>
+      </w:r>
+      <w:r>
+        <w:rPr>
+          <w:sz w:val="18"/>
+        </w:rPr>
+        <w:t>Gere contas administrativas e permissões.</w:t>
+      </w:r>
+    </w:p>
+    <w:p>
+      <w:pPr>
+        <w:keepLines/>
+        <w:spacing w:after="60"/>
+        <w:ind w:left="173"/>
+      </w:pPr>
+      <w:r>
+        <w:rPr>
+          <w:rFonts w:ascii="Consolas" w:hAnsi="Consolas"/>
+          <w:b/>
+          <w:sz w:val="17"/>
+        </w:rPr>
+        <w:t xml:space="preserve">admin/settings.php - </w:t>
+      </w:r>
+      <w:r>
+        <w:rPr>
+          <w:sz w:val="18"/>
+        </w:rPr>
+        <w:t>Configura dados gerais, contactos, SMTP, tema e opções da plataforma.</w:t>
+      </w:r>
+    </w:p>
+    <w:p>
+      <w:pPr>
+        <w:keepLines/>
+        <w:spacing w:after="60"/>
+        <w:ind w:left="173"/>
+      </w:pPr>
+      <w:r>
+        <w:rPr>
+          <w:rFonts w:ascii="Consolas" w:hAnsi="Consolas"/>
+          <w:b/>
+          <w:sz w:val="17"/>
+        </w:rPr>
+        <w:t xml:space="preserve">admin/admin_forbidden.php - </w:t>
+      </w:r>
+      <w:r>
+        <w:rPr>
+          <w:sz w:val="18"/>
+        </w:rPr>
+        <w:t>Informa quando o administrador não possui a permissão necessária.</w:t>
+      </w:r>
+    </w:p>
+    <w:p>
+      <w:pPr>
+        <w:keepLines/>
+        <w:spacing w:after="60"/>
+        <w:ind w:left="173"/>
+      </w:pPr>
+      <w:r>
+        <w:rPr>
+          <w:rFonts w:ascii="Consolas" w:hAnsi="Consolas"/>
+          <w:b/>
+          <w:sz w:val="17"/>
+        </w:rPr>
+        <w:t xml:space="preserve">admin/admin_header.php - </w:t>
+      </w:r>
+      <w:r>
+        <w:rPr>
+          <w:sz w:val="18"/>
+        </w:rPr>
+        <w:t>Constrói a navegação, cabeçalho e proteção comum da administração.</w:t>
+      </w:r>
+    </w:p>
+    <w:p>
+      <w:pPr>
+        <w:keepLines/>
+        <w:spacing w:after="60"/>
+        <w:ind w:left="173"/>
+      </w:pPr>
+      <w:r>
+        <w:rPr>
+          <w:rFonts w:ascii="Consolas" w:hAnsi="Consolas"/>
+          <w:b/>
+          <w:sz w:val="17"/>
+        </w:rPr>
+        <w:t xml:space="preserve">admin/admin_footer.php - </w:t>
+      </w:r>
+      <w:r>
+        <w:rPr>
+          <w:sz w:val="18"/>
+        </w:rPr>
+        <w:t>Fecha o layout administrativo e carrega os scripts partilhados.</w:t>
+      </w:r>
+    </w:p>
+    <w:p>
+      <w:pPr>
+        <w:pStyle w:val="Heading2"/>
+      </w:pPr>
+      <w:r>
+        <w:t>14.3 APIs</w:t>
+      </w:r>
+    </w:p>
+    <w:p>
+      <w:pPr>
+        <w:keepLines/>
+        <w:spacing w:after="60"/>
+        <w:ind w:left="173"/>
+      </w:pPr>
+      <w:r>
+        <w:rPr>
+          <w:rFonts w:ascii="Consolas" w:hAnsi="Consolas"/>
+          <w:b/>
+          <w:sz w:val="17"/>
+        </w:rPr>
+        <w:t xml:space="preserve">api/admin_review.php - </w:t>
+      </w:r>
+      <w:r>
+        <w:rPr>
+          <w:sz w:val="18"/>
+        </w:rPr>
+        <w:t>Recebe decisões de aprovação ou rejeição da administração.</w:t>
+      </w:r>
+    </w:p>
+    <w:p>
+      <w:pPr>
+        <w:keepLines/>
+        <w:spacing w:after="60"/>
+        <w:ind w:left="173"/>
+      </w:pPr>
+      <w:r>
+        <w:rPr>
+          <w:rFonts w:ascii="Consolas" w:hAnsi="Consolas"/>
+          <w:b/>
+          <w:sz w:val="17"/>
+        </w:rPr>
+        <w:t xml:space="preserve">api/admin_user_state.php - </w:t>
+      </w:r>
+      <w:r>
+        <w:rPr>
+          <w:sz w:val="18"/>
+        </w:rPr>
+        <w:t>Atualiza o estado de uma conta a partir do painel administrativo.</w:t>
+      </w:r>
+    </w:p>
+    <w:p>
+      <w:pPr>
+        <w:keepLines/>
+        <w:spacing w:after="60"/>
+        <w:ind w:left="173"/>
+      </w:pPr>
+      <w:r>
+        <w:rPr>
+          <w:rFonts w:ascii="Consolas" w:hAnsi="Consolas"/>
+          <w:b/>
+          <w:sz w:val="17"/>
+        </w:rPr>
+        <w:t xml:space="preserve">api/favorites.php - </w:t>
+      </w:r>
+      <w:r>
+        <w:rPr>
+          <w:sz w:val="18"/>
+        </w:rPr>
+        <w:t>Adiciona, remove e consulta favoritos do utilizador.</w:t>
+      </w:r>
+    </w:p>
+    <w:p>
+      <w:pPr>
+        <w:keepLines/>
+        <w:spacing w:after="60"/>
+        <w:ind w:left="173"/>
+      </w:pPr>
+      <w:r>
+        <w:rPr>
+          <w:rFonts w:ascii="Consolas" w:hAnsi="Consolas"/>
+          <w:b/>
+          <w:sz w:val="17"/>
+        </w:rPr>
+        <w:t xml:space="preserve">api/following.php - </w:t>
+      </w:r>
+      <w:r>
+        <w:rPr>
+          <w:sz w:val="18"/>
+        </w:rPr>
+        <w:t>Processa ações relacionadas com artistas seguidos.</w:t>
+      </w:r>
+    </w:p>
+    <w:p>
+      <w:pPr>
+        <w:keepLines/>
+        <w:spacing w:after="60"/>
+        <w:ind w:left="173"/>
+      </w:pPr>
+      <w:r>
+        <w:rPr>
+          <w:rFonts w:ascii="Consolas" w:hAnsi="Consolas"/>
+          <w:b/>
+          <w:sz w:val="17"/>
+        </w:rPr>
+        <w:t xml:space="preserve">api/toggle_follow.php - </w:t>
+      </w:r>
+      <w:r>
+        <w:rPr>
+          <w:sz w:val="18"/>
+        </w:rPr>
+        <w:t>Alterna o estado de seguimento de um artista.</w:t>
+      </w:r>
+    </w:p>
+    <w:p>
+      <w:pPr>
+        <w:keepLines/>
+        <w:spacing w:after="60"/>
+        <w:ind w:left="173"/>
+      </w:pPr>
+      <w:r>
+        <w:rPr>
+          <w:rFonts w:ascii="Consolas" w:hAnsi="Consolas"/>
+          <w:b/>
+          <w:sz w:val="17"/>
+        </w:rPr>
+        <w:t xml:space="preserve">api/listen.php - </w:t>
+      </w:r>
+      <w:r>
+        <w:rPr>
+          <w:sz w:val="18"/>
+        </w:rPr>
+        <w:t>Regista uma audição para estatísticas e relatórios.</w:t>
+      </w:r>
+    </w:p>
+    <w:p>
+      <w:pPr>
+        <w:keepLines/>
+        <w:spacing w:after="60"/>
+        <w:ind w:left="173"/>
+      </w:pPr>
+      <w:r>
+        <w:rPr>
+          <w:rFonts w:ascii="Consolas" w:hAnsi="Consolas"/>
+          <w:b/>
+          <w:sz w:val="17"/>
+        </w:rPr>
+        <w:t xml:space="preserve">api/playlists.php - </w:t>
+      </w:r>
+      <w:r>
+        <w:rPr>
+          <w:sz w:val="18"/>
+        </w:rPr>
+        <w:t>Cria playlists e gere as faixas guardadas.</w:t>
+      </w:r>
+    </w:p>
+    <w:p>
+      <w:pPr>
+        <w:keepLines/>
+        <w:spacing w:after="60"/>
+        <w:ind w:left="173"/>
+      </w:pPr>
+      <w:r>
+        <w:rPr>
+          <w:rFonts w:ascii="Consolas" w:hAnsi="Consolas"/>
+          <w:b/>
+          <w:sz w:val="17"/>
+        </w:rPr>
+        <w:t xml:space="preserve">api/toggle_item.php - </w:t>
+      </w:r>
+      <w:r>
+        <w:rPr>
+          <w:sz w:val="18"/>
+        </w:rPr>
+        <w:t>Ativa ou desativa conteúdos geridos pelo artista.</w:t>
+      </w:r>
+    </w:p>
+    <w:p>
+      <w:pPr>
+        <w:keepLines/>
+        <w:spacing w:after="60"/>
+        <w:ind w:left="173"/>
+      </w:pPr>
+      <w:r>
+        <w:rPr>
+          <w:rFonts w:ascii="Consolas" w:hAnsi="Consolas"/>
+          <w:b/>
+          <w:sz w:val="17"/>
+        </w:rPr>
+        <w:t xml:space="preserve">api/tracks.php - </w:t>
+      </w:r>
+      <w:r>
+        <w:rPr>
+          <w:sz w:val="18"/>
+        </w:rPr>
+        <w:t>Devolve ao leitor apenas faixas aprovadas e disponíveis.</w:t>
+      </w:r>
+    </w:p>
+    <w:p>
+      <w:pPr>
+        <w:pStyle w:val="Heading2"/>
+      </w:pPr>
+      <w:r>
+        <w:t>14.4 Backend partilhado</w:t>
+      </w:r>
+    </w:p>
+    <w:p>
+      <w:pPr>
+        <w:keepLines/>
+        <w:spacing w:after="60"/>
+        <w:ind w:left="173"/>
+      </w:pPr>
+      <w:r>
+        <w:rPr>
+          <w:rFonts w:ascii="Consolas" w:hAnsi="Consolas"/>
+          <w:b/>
+          <w:sz w:val="17"/>
+        </w:rPr>
+        <w:t xml:space="preserve">includes/config.php - </w:t>
+      </w:r>
+      <w:r>
+        <w:rPr>
+          <w:sz w:val="18"/>
+        </w:rPr>
+        <w:t>Inicia sessão, liga à base de dados e carrega todos os módulos comuns.</w:t>
+      </w:r>
+    </w:p>
+    <w:p>
+      <w:pPr>
+        <w:keepLines/>
+        <w:spacing w:after="60"/>
+        <w:ind w:left="173"/>
+      </w:pPr>
+      <w:r>
+        <w:rPr>
+          <w:rFonts w:ascii="Consolas" w:hAnsi="Consolas"/>
+          <w:b/>
+          <w:sz w:val="17"/>
+        </w:rPr>
+        <w:t xml:space="preserve">includes/config.local.php - </w:t>
+      </w:r>
+      <w:r>
+        <w:rPr>
+          <w:sz w:val="18"/>
+        </w:rPr>
+        <w:t>Guarda credenciais locais e não é publicado no Git.</w:t>
+      </w:r>
+    </w:p>
+    <w:p>
+      <w:pPr>
+        <w:keepLines/>
+        <w:spacing w:after="60"/>
+        <w:ind w:left="173"/>
+      </w:pPr>
+      <w:r>
+        <w:rPr>
+          <w:rFonts w:ascii="Consolas" w:hAnsi="Consolas"/>
+          <w:b/>
+          <w:sz w:val="17"/>
+        </w:rPr>
+        <w:t xml:space="preserve">includes/db.php - </w:t>
+      </w:r>
+      <w:r>
+        <w:rPr>
+          <w:sz w:val="18"/>
+        </w:rPr>
+        <w:t>Fornece funções reutilizáveis para consultas SQL.</w:t>
+      </w:r>
+    </w:p>
+    <w:p>
+      <w:pPr>
+        <w:keepLines/>
+        <w:spacing w:after="60"/>
+        <w:ind w:left="173"/>
+      </w:pPr>
+      <w:r>
+        <w:rPr>
+          <w:rFonts w:ascii="Consolas" w:hAnsi="Consolas"/>
+          <w:b/>
+          <w:sz w:val="17"/>
+        </w:rPr>
+        <w:t xml:space="preserve">includes/auth.php - </w:t>
+      </w:r>
+      <w:r>
+        <w:rPr>
+          <w:sz w:val="18"/>
+        </w:rPr>
+        <w:t>Controla autenticação, sessão e permissões de utilizadores e administradores.</w:t>
+      </w:r>
+    </w:p>
+    <w:p>
+      <w:pPr>
+        <w:keepLines/>
+        <w:spacing w:after="60"/>
+        <w:ind w:left="173"/>
+      </w:pPr>
+      <w:r>
+        <w:rPr>
+          <w:rFonts w:ascii="Consolas" w:hAnsi="Consolas"/>
+          <w:b/>
+          <w:sz w:val="17"/>
+        </w:rPr>
+        <w:t xml:space="preserve">includes/auth_tokens.php - </w:t>
+      </w:r>
+      <w:r>
+        <w:rPr>
+          <w:sz w:val="18"/>
+        </w:rPr>
+        <w:t>Cria e valida códigos temporários de verificação e recuperação.</w:t>
+      </w:r>
+    </w:p>
+    <w:p>
+      <w:pPr>
+        <w:keepLines/>
+        <w:spacing w:after="60"/>
+        <w:ind w:left="173"/>
+      </w:pPr>
+      <w:r>
+        <w:rPr>
+          <w:rFonts w:ascii="Consolas" w:hAnsi="Consolas"/>
+          <w:b/>
+          <w:sz w:val="17"/>
+        </w:rPr>
+        <w:t xml:space="preserve">includes/email.php - </w:t>
+      </w:r>
+      <w:r>
+        <w:rPr>
+          <w:sz w:val="18"/>
+        </w:rPr>
+        <w:t>Envia e-mails de conta, encomenda, venda, moderação e notificações.</w:t>
+      </w:r>
+    </w:p>
+    <w:p>
+      <w:pPr>
+        <w:keepLines/>
+        <w:spacing w:after="60"/>
+        <w:ind w:left="173"/>
+      </w:pPr>
+      <w:r>
+        <w:rPr>
+          <w:rFonts w:ascii="Consolas" w:hAnsi="Consolas"/>
+          <w:b/>
+          <w:sz w:val="17"/>
+        </w:rPr>
+        <w:t xml:space="preserve">includes/header.php - </w:t>
+      </w:r>
+      <w:r>
+        <w:rPr>
+          <w:sz w:val="18"/>
+        </w:rPr>
+        <w:t>Constrói sidebar, topo, navegação e estrutura comum das páginas públicas.</w:t>
+      </w:r>
+    </w:p>
+    <w:p>
+      <w:pPr>
+        <w:keepLines/>
+        <w:spacing w:after="60"/>
+        <w:ind w:left="173"/>
+      </w:pPr>
+      <w:r>
+        <w:rPr>
+          <w:rFonts w:ascii="Consolas" w:hAnsi="Consolas"/>
+          <w:b/>
+          <w:sz w:val="17"/>
+        </w:rPr>
+        <w:t xml:space="preserve">includes/footer.php - </w:t>
+      </w:r>
+      <w:r>
+        <w:rPr>
+          <w:sz w:val="18"/>
+        </w:rPr>
+        <w:t>Fecha o layout, apresenta rodapé/cookies e carrega scripts do browser.</w:t>
+      </w:r>
+    </w:p>
+    <w:p>
+      <w:pPr>
+        <w:keepLines/>
+        <w:spacing w:after="60"/>
+        <w:ind w:left="173"/>
+      </w:pPr>
+      <w:r>
+        <w:rPr>
+          <w:rFonts w:ascii="Consolas" w:hAnsi="Consolas"/>
+          <w:b/>
+          <w:sz w:val="17"/>
+        </w:rPr>
+        <w:t xml:space="preserve">includes/helpers.php - </w:t>
+      </w:r>
+      <w:r>
+        <w:rPr>
+          <w:sz w:val="18"/>
+        </w:rPr>
+        <w:t>Reúne formatação, caminhos, notificações e utilitários partilhados.</w:t>
+      </w:r>
+    </w:p>
+    <w:p>
+      <w:pPr>
+        <w:keepLines/>
+        <w:spacing w:after="60"/>
+        <w:ind w:left="173"/>
+      </w:pPr>
+      <w:r>
+        <w:rPr>
+          <w:rFonts w:ascii="Consolas" w:hAnsi="Consolas"/>
+          <w:b/>
+          <w:sz w:val="17"/>
+        </w:rPr>
+        <w:t xml:space="preserve">includes/i18n.php - </w:t>
+      </w:r>
+      <w:r>
+        <w:rPr>
+          <w:sz w:val="18"/>
+        </w:rPr>
+        <w:t>Controla idioma e traduções em português e inglês.</w:t>
+      </w:r>
+    </w:p>
+    <w:p>
+      <w:pPr>
+        <w:keepLines/>
+        <w:spacing w:after="60"/>
+        <w:ind w:left="173"/>
+      </w:pPr>
+      <w:r>
+        <w:rPr>
+          <w:rFonts w:ascii="Consolas" w:hAnsi="Consolas"/>
+          <w:b/>
+          <w:sz w:val="17"/>
+        </w:rPr>
+        <w:t xml:space="preserve">includes/maintenance.php - </w:t>
+      </w:r>
+      <w:r>
+        <w:rPr>
+          <w:sz w:val="18"/>
+        </w:rPr>
+        <w:t>Verifica se uma página está ativa ou em manutenção.</w:t>
+      </w:r>
+    </w:p>
+    <w:p>
+      <w:pPr>
+        <w:keepLines/>
+        <w:spacing w:after="60"/>
+        <w:ind w:left="173"/>
+      </w:pPr>
+      <w:r>
+        <w:rPr>
+          <w:rFonts w:ascii="Consolas" w:hAnsi="Consolas"/>
+          <w:b/>
+          <w:sz w:val="17"/>
+        </w:rPr>
+        <w:t xml:space="preserve">includes/product_images.php - </w:t>
+      </w:r>
+      <w:r>
+        <w:rPr>
+          <w:sz w:val="18"/>
+        </w:rPr>
+        <w:t>Normaliza e resolve imagens dos produtos.</w:t>
+      </w:r>
+    </w:p>
+    <w:p>
+      <w:pPr>
+        <w:keepLines/>
+        <w:spacing w:after="60"/>
+        <w:ind w:left="173"/>
+      </w:pPr>
+      <w:r>
+        <w:rPr>
+          <w:rFonts w:ascii="Consolas" w:hAnsi="Consolas"/>
+          <w:b/>
+          <w:sz w:val="17"/>
+        </w:rPr>
+        <w:t xml:space="preserve">includes/schema.php - </w:t>
+      </w:r>
+      <w:r>
+        <w:rPr>
+          <w:sz w:val="18"/>
+        </w:rPr>
+        <w:t>Garante a existência e atualização das tabelas necessárias.</w:t>
+      </w:r>
+    </w:p>
+    <w:p>
+      <w:pPr>
+        <w:keepLines/>
+        <w:spacing w:after="60"/>
+        <w:ind w:left="173"/>
+      </w:pPr>
+      <w:r>
+        <w:rPr>
+          <w:rFonts w:ascii="Consolas" w:hAnsi="Consolas"/>
+          <w:b/>
+          <w:sz w:val="17"/>
+        </w:rPr>
+        <w:t xml:space="preserve">includes/settings.php - </w:t>
+      </w:r>
+      <w:r>
+        <w:rPr>
+          <w:sz w:val="18"/>
+        </w:rPr>
+        <w:t>Lê e grava definições da plataforma.</w:t>
+      </w:r>
+    </w:p>
+    <w:p>
+      <w:pPr>
+        <w:keepLines/>
+        <w:spacing w:after="60"/>
+        <w:ind w:left="173"/>
+      </w:pPr>
+      <w:r>
+        <w:rPr>
+          <w:rFonts w:ascii="Consolas" w:hAnsi="Consolas"/>
+          <w:b/>
+          <w:sz w:val="17"/>
+        </w:rPr>
+        <w:t xml:space="preserve">includes/validation.php - </w:t>
+      </w:r>
+      <w:r>
+        <w:rPr>
+          <w:sz w:val="18"/>
+        </w:rPr>
+        <w:t>Centraliza validações de nomes, e-mails, palavras-passe e uploads.</w:t>
       </w:r>
     </w:p>
     <w:sectPr>

</xml_diff>